<commit_message>
FCT Zombie Types Create
Ajout de la vue Create permettant de créer un type de zombie
</commit_message>
<xml_diff>
--- a/S01_Lab2_Instructions.docx
+++ b/S01_Lab2_Instructions.docx
@@ -1,6 +1,6 @@
 
 <file path=word/document.xml><?xml version="1.0" encoding="utf-8"?>
-<w:document xmlns:wpc="http://schemas.microsoft.com/office/word/2010/wordprocessingCanvas" xmlns:cx="http://schemas.microsoft.com/office/drawing/2014/chartex" xmlns:cx1="http://schemas.microsoft.com/office/drawing/2015/9/8/chartex" xmlns:cx2="http://schemas.microsoft.com/office/drawing/2015/10/21/chartex" xmlns:cx3="http://schemas.microsoft.com/office/drawing/2016/5/9/chartex" xmlns:cx4="http://schemas.microsoft.com/office/drawing/2016/5/10/chartex" xmlns:cx5="http://schemas.microsoft.com/office/drawing/2016/5/11/chartex" xmlns:cx6="http://schemas.microsoft.com/office/drawing/2016/5/12/chartex" xmlns:cx7="http://schemas.microsoft.com/office/drawing/2016/5/13/chartex" xmlns:cx8="http://schemas.microsoft.com/office/drawing/2016/5/14/chartex" xmlns:mc="http://schemas.openxmlformats.org/markup-compatibility/2006" xmlns:aink="http://schemas.microsoft.com/office/drawing/2016/ink" xmlns:am3d="http://schemas.microsoft.com/office/drawing/2017/model3d" xmlns:o="urn:schemas-microsoft-com:office:office" xmlns:oel="http://schemas.microsoft.com/office/2019/extlst" xmlns:r="http://schemas.openxmlformats.org/officeDocument/2006/relationships" xmlns:m="http://schemas.openxmlformats.org/officeDocument/2006/math" xmlns:v="urn:schemas-microsoft-com:vml" xmlns:wp14="http://schemas.microsoft.com/office/word/2010/wordprocessingDrawing" xmlns:wp="http://schemas.openxmlformats.org/drawingml/2006/wordprocessingDrawing" xmlns:w10="urn:schemas-microsoft-com:office:word" xmlns:w="http://schemas.openxmlformats.org/wordprocessingml/2006/main" xmlns:w14="http://schemas.microsoft.com/office/word/2010/wordml" xmlns:w15="http://schemas.microsoft.com/office/word/2012/wordml" xmlns:w16cex="http://schemas.microsoft.com/office/word/2018/wordml/cex" xmlns:w16cid="http://schemas.microsoft.com/office/word/2016/wordml/cid" xmlns:w16="http://schemas.microsoft.com/office/word/2018/wordml" xmlns:w16du="http://schemas.microsoft.com/office/word/2023/wordml/word16du" xmlns:w16sdtdh="http://schemas.microsoft.com/office/word/2020/wordml/sdtdatahash" xmlns:w16sdtfl="http://schemas.microsoft.com/office/word/2024/wordml/sdtformatlock" xmlns:w16se="http://schemas.microsoft.com/office/word/2015/wordml/symex" xmlns:wpg="http://schemas.microsoft.com/office/word/2010/wordprocessingGroup" xmlns:wpi="http://schemas.microsoft.com/office/word/2010/wordprocessingInk" xmlns:wne="http://schemas.microsoft.com/office/word/2006/wordml" xmlns:wps="http://schemas.microsoft.com/office/word/2010/wordprocessingShape" mc:Ignorable="w14 w15 w16se w16cid w16 w16cex w16sdtdh w16sdtfl w16du wp14">
+<w:document xmlns:wpc="http://schemas.microsoft.com/office/word/2010/wordprocessingCanvas" xmlns:cx="http://schemas.microsoft.com/office/drawing/2014/chartex" xmlns:cx1="http://schemas.microsoft.com/office/drawing/2015/9/8/chartex" xmlns:cx2="http://schemas.microsoft.com/office/drawing/2015/10/21/chartex" xmlns:cx3="http://schemas.microsoft.com/office/drawing/2016/5/9/chartex" xmlns:cx4="http://schemas.microsoft.com/office/drawing/2016/5/10/chartex" xmlns:cx5="http://schemas.microsoft.com/office/drawing/2016/5/11/chartex" xmlns:cx6="http://schemas.microsoft.com/office/drawing/2016/5/12/chartex" xmlns:cx7="http://schemas.microsoft.com/office/drawing/2016/5/13/chartex" xmlns:cx8="http://schemas.microsoft.com/office/drawing/2016/5/14/chartex" xmlns:mc="http://schemas.openxmlformats.org/markup-compatibility/2006" xmlns:aink="http://schemas.microsoft.com/office/drawing/2016/ink" xmlns:am3d="http://schemas.microsoft.com/office/drawing/2017/model3d" xmlns:o="urn:schemas-microsoft-com:office:office" xmlns:oel="http://schemas.microsoft.com/office/2019/extlst" xmlns:r="http://schemas.openxmlformats.org/officeDocument/2006/relationships" xmlns:m="http://schemas.openxmlformats.org/officeDocument/2006/math" xmlns:v="urn:schemas-microsoft-com:vml" xmlns:wp14="http://schemas.microsoft.com/office/word/2010/wordprocessingDrawing" xmlns:wp="http://schemas.openxmlformats.org/drawingml/2006/wordprocessingDrawing" xmlns:w10="urn:schemas-microsoft-com:office:word" xmlns:w="http://schemas.openxmlformats.org/wordprocessingml/2006/main" xmlns:w14="http://schemas.microsoft.com/office/word/2010/wordml" xmlns:w15="http://schemas.microsoft.com/office/word/2012/wordml" xmlns:w16cei="http://schemas.microsoft.com/office/word/2026/wordml/cei" xmlns:w16cex="http://schemas.microsoft.com/office/word/2018/wordml/cex" xmlns:w16cid="http://schemas.microsoft.com/office/word/2016/wordml/cid" xmlns:w16="http://schemas.microsoft.com/office/word/2018/wordml" xmlns:w16du="http://schemas.microsoft.com/office/word/2023/wordml/word16du" xmlns:w16sdtdh="http://schemas.microsoft.com/office/word/2020/wordml/sdtdatahash" xmlns:w16sdtfl="http://schemas.microsoft.com/office/word/2024/wordml/sdtformatlock" xmlns:w16se="http://schemas.microsoft.com/office/word/2015/wordml/symex" xmlns:wpg="http://schemas.microsoft.com/office/word/2010/wordprocessingGroup" xmlns:wpi="http://schemas.microsoft.com/office/word/2010/wordprocessingInk" xmlns:wne="http://schemas.microsoft.com/office/word/2006/wordml" xmlns:wps="http://schemas.microsoft.com/office/word/2010/wordprocessingShape" mc:Ignorable="w14 w15 w16se w16cid w16 w16cex w16sdtdh w16sdtfl w16du wp14">
   <w:background w:color="EBF9FF"/>
   <w:body>
     <w:p>
@@ -667,7 +667,23 @@
           <w:b/>
           <w:bCs/>
         </w:rPr>
-        <w:t xml:space="preserve"> Net Core </w:t>
+        <w:t xml:space="preserve"> Net </w:t>
+      </w:r>
+      <w:proofErr w:type="spellStart"/>
+      <w:r>
+        <w:rPr>
+          <w:b/>
+          <w:bCs/>
+        </w:rPr>
+        <w:t>Core</w:t>
+      </w:r>
+      <w:proofErr w:type="spellEnd"/>
+      <w:r>
+        <w:rPr>
+          <w:b/>
+          <w:bCs/>
+        </w:rPr>
+        <w:t xml:space="preserve"> </w:t>
       </w:r>
       <w:r>
         <w:rPr>
@@ -847,16 +863,11 @@
         </w:numPr>
         <w:spacing w:before="0" w:after="160" w:line="259" w:lineRule="auto"/>
       </w:pPr>
-      <w:proofErr w:type="gramStart"/>
       <w:r>
         <w:t>.</w:t>
       </w:r>
       <w:r>
-        <w:t>NET</w:t>
-      </w:r>
-      <w:proofErr w:type="gramEnd"/>
-      <w:r>
-        <w:t xml:space="preserve"> </w:t>
+        <w:t xml:space="preserve">NET </w:t>
       </w:r>
       <w:r>
         <w:t>8</w:t>
@@ -2375,7 +2386,7 @@
           <w:noProof/>
         </w:rPr>
         <w:drawing>
-          <wp:inline distT="0" distB="0" distL="0" distR="0" wp14:anchorId="2A3568C3" wp14:editId="6FC782A7">
+          <wp:inline distT="0" distB="0" distL="0" distR="0" wp14:anchorId="2A3568C3" wp14:editId="72B0B281">
             <wp:extent cx="1722213" cy="644379"/>
             <wp:effectExtent l="0" t="0" r="0" b="3810"/>
             <wp:docPr id="8" name="Image 8"/>
@@ -2927,7 +2938,6 @@
         <w:spacing w:before="0" w:after="160" w:line="259" w:lineRule="auto"/>
       </w:pPr>
       <w:proofErr w:type="spellStart"/>
-      <w:proofErr w:type="gramStart"/>
       <w:r>
         <w:rPr>
           <w:rFonts w:ascii="Consolas" w:hAnsi="Consolas" w:cs="Consolas"/>
@@ -2937,7 +2947,6 @@
         <w:t>navbar</w:t>
       </w:r>
       <w:proofErr w:type="spellEnd"/>
-      <w:proofErr w:type="gramEnd"/>
       <w:r>
         <w:rPr>
           <w:rFonts w:ascii="Consolas" w:hAnsi="Consolas" w:cs="Consolas"/>
@@ -2957,7 +2966,6 @@
         <w:spacing w:before="0" w:after="160" w:line="259" w:lineRule="auto"/>
       </w:pPr>
       <w:proofErr w:type="spellStart"/>
-      <w:proofErr w:type="gramStart"/>
       <w:r>
         <w:rPr>
           <w:rFonts w:ascii="Consolas" w:hAnsi="Consolas" w:cs="Consolas"/>
@@ -2967,7 +2975,6 @@
         <w:t>bg</w:t>
       </w:r>
       <w:proofErr w:type="spellEnd"/>
-      <w:proofErr w:type="gramEnd"/>
       <w:r>
         <w:rPr>
           <w:rFonts w:ascii="Consolas" w:hAnsi="Consolas" w:cs="Consolas"/>
@@ -3003,23 +3010,13 @@
         <w:spacing w:before="0" w:after="160" w:line="259" w:lineRule="auto"/>
       </w:pPr>
       <w:proofErr w:type="spellStart"/>
-      <w:proofErr w:type="gramStart"/>
       <w:r>
         <w:rPr>
           <w:rFonts w:ascii="Consolas" w:hAnsi="Consolas" w:cs="Consolas"/>
           <w:sz w:val="19"/>
           <w:szCs w:val="19"/>
         </w:rPr>
-        <w:t>navbar</w:t>
-      </w:r>
-      <w:proofErr w:type="gramEnd"/>
-      <w:r>
-        <w:rPr>
-          <w:rFonts w:ascii="Consolas" w:hAnsi="Consolas" w:cs="Consolas"/>
-          <w:sz w:val="19"/>
-          <w:szCs w:val="19"/>
-        </w:rPr>
-        <w:t>-</w:t>
+        <w:t>navbar-</w:t>
       </w:r>
       <w:r>
         <w:rPr>
@@ -3041,23 +3038,13 @@
         <w:spacing w:before="0" w:after="160" w:line="259" w:lineRule="auto"/>
       </w:pPr>
       <w:proofErr w:type="spellStart"/>
-      <w:proofErr w:type="gramStart"/>
       <w:r>
         <w:rPr>
           <w:rFonts w:ascii="Consolas" w:hAnsi="Consolas" w:cs="Consolas"/>
           <w:sz w:val="19"/>
           <w:szCs w:val="19"/>
         </w:rPr>
-        <w:t>bg</w:t>
-      </w:r>
-      <w:proofErr w:type="gramEnd"/>
-      <w:r>
-        <w:rPr>
-          <w:rFonts w:ascii="Consolas" w:hAnsi="Consolas" w:cs="Consolas"/>
-          <w:sz w:val="19"/>
-          <w:szCs w:val="19"/>
-        </w:rPr>
-        <w:t>-</w:t>
+        <w:t>bg-</w:t>
       </w:r>
       <w:r>
         <w:rPr>
@@ -4893,7 +4880,6 @@
         </w:rPr>
         <w:t xml:space="preserve">        </w:t>
       </w:r>
-      <w:proofErr w:type="gramStart"/>
       <w:r>
         <w:rPr>
           <w:rFonts w:ascii="Consolas" w:hAnsi="Consolas" w:cs="Consolas"/>
@@ -4904,7 +4890,6 @@
         </w:rPr>
         <w:t>new</w:t>
       </w:r>
-      <w:proofErr w:type="gramEnd"/>
       <w:r>
         <w:rPr>
           <w:rFonts w:ascii="Consolas" w:hAnsi="Consolas" w:cs="Consolas"/>
@@ -4913,29 +4898,7 @@
           <w:szCs w:val="19"/>
           <w:highlight w:val="green"/>
         </w:rPr>
-        <w:t xml:space="preserve"> </w:t>
-      </w:r>
-      <w:proofErr w:type="gramStart"/>
-      <w:r>
-        <w:rPr>
-          <w:rFonts w:ascii="Consolas" w:hAnsi="Consolas" w:cs="Consolas"/>
-          <w:color w:val="000000"/>
-          <w:sz w:val="19"/>
-          <w:szCs w:val="19"/>
-          <w:highlight w:val="green"/>
-        </w:rPr>
-        <w:t>Zombie(){</w:t>
-      </w:r>
-      <w:proofErr w:type="gramEnd"/>
-      <w:r>
-        <w:rPr>
-          <w:rFonts w:ascii="Consolas" w:hAnsi="Consolas" w:cs="Consolas"/>
-          <w:color w:val="000000"/>
-          <w:sz w:val="19"/>
-          <w:szCs w:val="19"/>
-          <w:highlight w:val="green"/>
-        </w:rPr>
-        <w:t xml:space="preserve">Name= </w:t>
+        <w:t xml:space="preserve"> Zombie(){Name= </w:t>
       </w:r>
       <w:r>
         <w:rPr>
@@ -5031,7 +4994,6 @@
         </w:rPr>
         <w:t xml:space="preserve">        </w:t>
       </w:r>
-      <w:proofErr w:type="gramStart"/>
       <w:r>
         <w:rPr>
           <w:rFonts w:ascii="Consolas" w:hAnsi="Consolas" w:cs="Consolas"/>
@@ -5042,7 +5004,6 @@
         </w:rPr>
         <w:t>new</w:t>
       </w:r>
-      <w:proofErr w:type="gramEnd"/>
       <w:r>
         <w:rPr>
           <w:rFonts w:ascii="Consolas" w:hAnsi="Consolas" w:cs="Consolas"/>
@@ -5051,29 +5012,7 @@
           <w:szCs w:val="19"/>
           <w:highlight w:val="green"/>
         </w:rPr>
-        <w:t xml:space="preserve"> </w:t>
-      </w:r>
-      <w:proofErr w:type="gramStart"/>
-      <w:r>
-        <w:rPr>
-          <w:rFonts w:ascii="Consolas" w:hAnsi="Consolas" w:cs="Consolas"/>
-          <w:color w:val="000000"/>
-          <w:sz w:val="19"/>
-          <w:szCs w:val="19"/>
-          <w:highlight w:val="green"/>
-        </w:rPr>
-        <w:t>Zombie(){</w:t>
-      </w:r>
-      <w:proofErr w:type="gramEnd"/>
-      <w:r>
-        <w:rPr>
-          <w:rFonts w:ascii="Consolas" w:hAnsi="Consolas" w:cs="Consolas"/>
-          <w:color w:val="000000"/>
-          <w:sz w:val="19"/>
-          <w:szCs w:val="19"/>
-          <w:highlight w:val="green"/>
-        </w:rPr>
-        <w:t xml:space="preserve">Name= </w:t>
+        <w:t xml:space="preserve"> Zombie(){Name= </w:t>
       </w:r>
       <w:r>
         <w:rPr>
@@ -5147,7 +5086,6 @@
         </w:rPr>
         <w:t xml:space="preserve">        </w:t>
       </w:r>
-      <w:proofErr w:type="gramStart"/>
       <w:r>
         <w:rPr>
           <w:rFonts w:ascii="Consolas" w:hAnsi="Consolas" w:cs="Consolas"/>
@@ -5158,7 +5096,6 @@
         </w:rPr>
         <w:t>new</w:t>
       </w:r>
-      <w:proofErr w:type="gramEnd"/>
       <w:r>
         <w:rPr>
           <w:rFonts w:ascii="Consolas" w:hAnsi="Consolas" w:cs="Consolas"/>
@@ -5167,29 +5104,7 @@
           <w:szCs w:val="19"/>
           <w:highlight w:val="green"/>
         </w:rPr>
-        <w:t xml:space="preserve"> </w:t>
-      </w:r>
-      <w:proofErr w:type="gramStart"/>
-      <w:r>
-        <w:rPr>
-          <w:rFonts w:ascii="Consolas" w:hAnsi="Consolas" w:cs="Consolas"/>
-          <w:color w:val="000000"/>
-          <w:sz w:val="19"/>
-          <w:szCs w:val="19"/>
-          <w:highlight w:val="green"/>
-        </w:rPr>
-        <w:t>Zombie(){</w:t>
-      </w:r>
-      <w:proofErr w:type="gramEnd"/>
-      <w:r>
-        <w:rPr>
-          <w:rFonts w:ascii="Consolas" w:hAnsi="Consolas" w:cs="Consolas"/>
-          <w:color w:val="000000"/>
-          <w:sz w:val="19"/>
-          <w:szCs w:val="19"/>
-          <w:highlight w:val="green"/>
-        </w:rPr>
-        <w:t xml:space="preserve">Name= </w:t>
+        <w:t xml:space="preserve"> Zombie(){Name= </w:t>
       </w:r>
       <w:r>
         <w:rPr>
@@ -5199,29 +5114,7 @@
           <w:szCs w:val="19"/>
           <w:highlight w:val="green"/>
         </w:rPr>
-        <w:t>"</w:t>
-      </w:r>
-      <w:proofErr w:type="spellStart"/>
-      <w:r>
-        <w:rPr>
-          <w:rFonts w:ascii="Consolas" w:hAnsi="Consolas" w:cs="Consolas"/>
-          <w:color w:val="A31515"/>
-          <w:sz w:val="19"/>
-          <w:szCs w:val="19"/>
-          <w:highlight w:val="green"/>
-        </w:rPr>
-        <w:t>Draugr</w:t>
-      </w:r>
-      <w:proofErr w:type="spellEnd"/>
-      <w:r>
-        <w:rPr>
-          <w:rFonts w:ascii="Consolas" w:hAnsi="Consolas" w:cs="Consolas"/>
-          <w:color w:val="A31515"/>
-          <w:sz w:val="19"/>
-          <w:szCs w:val="19"/>
-          <w:highlight w:val="green"/>
-        </w:rPr>
-        <w:t>"</w:t>
+        <w:t>"Draugr"</w:t>
       </w:r>
       <w:r>
         <w:rPr>
@@ -5285,7 +5178,6 @@
         </w:rPr>
         <w:t xml:space="preserve">        </w:t>
       </w:r>
-      <w:proofErr w:type="gramStart"/>
       <w:r>
         <w:rPr>
           <w:rFonts w:ascii="Consolas" w:hAnsi="Consolas" w:cs="Consolas"/>
@@ -5296,7 +5188,6 @@
         </w:rPr>
         <w:t>new</w:t>
       </w:r>
-      <w:proofErr w:type="gramEnd"/>
       <w:r>
         <w:rPr>
           <w:rFonts w:ascii="Consolas" w:hAnsi="Consolas" w:cs="Consolas"/>
@@ -5305,29 +5196,7 @@
           <w:szCs w:val="19"/>
           <w:highlight w:val="green"/>
         </w:rPr>
-        <w:t xml:space="preserve"> </w:t>
-      </w:r>
-      <w:proofErr w:type="gramStart"/>
-      <w:r>
-        <w:rPr>
-          <w:rFonts w:ascii="Consolas" w:hAnsi="Consolas" w:cs="Consolas"/>
-          <w:color w:val="000000"/>
-          <w:sz w:val="19"/>
-          <w:szCs w:val="19"/>
-          <w:highlight w:val="green"/>
-        </w:rPr>
-        <w:t>Zombie(){</w:t>
-      </w:r>
-      <w:proofErr w:type="gramEnd"/>
-      <w:r>
-        <w:rPr>
-          <w:rFonts w:ascii="Consolas" w:hAnsi="Consolas" w:cs="Consolas"/>
-          <w:color w:val="000000"/>
-          <w:sz w:val="19"/>
-          <w:szCs w:val="19"/>
-          <w:highlight w:val="green"/>
-        </w:rPr>
-        <w:t xml:space="preserve">Name= </w:t>
+        <w:t xml:space="preserve"> Zombie(){Name= </w:t>
       </w:r>
       <w:r>
         <w:rPr>
@@ -5401,7 +5270,6 @@
         </w:rPr>
         <w:t xml:space="preserve">        </w:t>
       </w:r>
-      <w:proofErr w:type="gramStart"/>
       <w:r>
         <w:rPr>
           <w:rFonts w:ascii="Consolas" w:hAnsi="Consolas" w:cs="Consolas"/>
@@ -5412,7 +5280,6 @@
         </w:rPr>
         <w:t>new</w:t>
       </w:r>
-      <w:proofErr w:type="gramEnd"/>
       <w:r>
         <w:rPr>
           <w:rFonts w:ascii="Consolas" w:hAnsi="Consolas" w:cs="Consolas"/>
@@ -5421,29 +5288,7 @@
           <w:szCs w:val="19"/>
           <w:highlight w:val="green"/>
         </w:rPr>
-        <w:t xml:space="preserve"> </w:t>
-      </w:r>
-      <w:proofErr w:type="gramStart"/>
-      <w:r>
-        <w:rPr>
-          <w:rFonts w:ascii="Consolas" w:hAnsi="Consolas" w:cs="Consolas"/>
-          <w:color w:val="000000"/>
-          <w:sz w:val="19"/>
-          <w:szCs w:val="19"/>
-          <w:highlight w:val="green"/>
-        </w:rPr>
-        <w:t>Zombie(){</w:t>
-      </w:r>
-      <w:proofErr w:type="gramEnd"/>
-      <w:r>
-        <w:rPr>
-          <w:rFonts w:ascii="Consolas" w:hAnsi="Consolas" w:cs="Consolas"/>
-          <w:color w:val="000000"/>
-          <w:sz w:val="19"/>
-          <w:szCs w:val="19"/>
-          <w:highlight w:val="green"/>
-        </w:rPr>
-        <w:t xml:space="preserve">Name= </w:t>
+        <w:t xml:space="preserve"> Zombie(){Name= </w:t>
       </w:r>
       <w:r>
         <w:rPr>
@@ -5539,7 +5384,6 @@
         </w:rPr>
         <w:t xml:space="preserve">        </w:t>
       </w:r>
-      <w:proofErr w:type="gramStart"/>
       <w:r>
         <w:rPr>
           <w:rFonts w:ascii="Consolas" w:hAnsi="Consolas" w:cs="Consolas"/>
@@ -5550,7 +5394,6 @@
         </w:rPr>
         <w:t>new</w:t>
       </w:r>
-      <w:proofErr w:type="gramEnd"/>
       <w:r>
         <w:rPr>
           <w:rFonts w:ascii="Consolas" w:hAnsi="Consolas" w:cs="Consolas"/>
@@ -5559,29 +5402,7 @@
           <w:szCs w:val="19"/>
           <w:highlight w:val="green"/>
         </w:rPr>
-        <w:t xml:space="preserve"> </w:t>
-      </w:r>
-      <w:proofErr w:type="gramStart"/>
-      <w:r>
-        <w:rPr>
-          <w:rFonts w:ascii="Consolas" w:hAnsi="Consolas" w:cs="Consolas"/>
-          <w:color w:val="000000"/>
-          <w:sz w:val="19"/>
-          <w:szCs w:val="19"/>
-          <w:highlight w:val="green"/>
-        </w:rPr>
-        <w:t>Zombie(){</w:t>
-      </w:r>
-      <w:proofErr w:type="gramEnd"/>
-      <w:r>
-        <w:rPr>
-          <w:rFonts w:ascii="Consolas" w:hAnsi="Consolas" w:cs="Consolas"/>
-          <w:color w:val="000000"/>
-          <w:sz w:val="19"/>
-          <w:szCs w:val="19"/>
-          <w:highlight w:val="green"/>
-        </w:rPr>
-        <w:t xml:space="preserve">Name= </w:t>
+        <w:t xml:space="preserve"> Zombie(){Name= </w:t>
       </w:r>
       <w:r>
         <w:rPr>
@@ -5655,7 +5476,6 @@
         </w:rPr>
         <w:t xml:space="preserve">        </w:t>
       </w:r>
-      <w:proofErr w:type="gramStart"/>
       <w:r>
         <w:rPr>
           <w:rFonts w:ascii="Consolas" w:hAnsi="Consolas" w:cs="Consolas"/>
@@ -5666,7 +5486,6 @@
         </w:rPr>
         <w:t>new</w:t>
       </w:r>
-      <w:proofErr w:type="gramEnd"/>
       <w:r>
         <w:rPr>
           <w:rFonts w:ascii="Consolas" w:hAnsi="Consolas" w:cs="Consolas"/>
@@ -5675,29 +5494,7 @@
           <w:szCs w:val="19"/>
           <w:highlight w:val="green"/>
         </w:rPr>
-        <w:t xml:space="preserve"> </w:t>
-      </w:r>
-      <w:proofErr w:type="gramStart"/>
-      <w:r>
-        <w:rPr>
-          <w:rFonts w:ascii="Consolas" w:hAnsi="Consolas" w:cs="Consolas"/>
-          <w:color w:val="000000"/>
-          <w:sz w:val="19"/>
-          <w:szCs w:val="19"/>
-          <w:highlight w:val="green"/>
-        </w:rPr>
-        <w:t>Zombie(){</w:t>
-      </w:r>
-      <w:proofErr w:type="gramEnd"/>
-      <w:r>
-        <w:rPr>
-          <w:rFonts w:ascii="Consolas" w:hAnsi="Consolas" w:cs="Consolas"/>
-          <w:color w:val="000000"/>
-          <w:sz w:val="19"/>
-          <w:szCs w:val="19"/>
-          <w:highlight w:val="green"/>
-        </w:rPr>
-        <w:t xml:space="preserve">Name= </w:t>
+        <w:t xml:space="preserve"> Zombie(){Name= </w:t>
       </w:r>
       <w:r>
         <w:rPr>
@@ -5821,7 +5618,6 @@
         </w:rPr>
         <w:t xml:space="preserve">    </w:t>
       </w:r>
-      <w:proofErr w:type="gramStart"/>
       <w:r>
         <w:rPr>
           <w:rFonts w:ascii="Consolas" w:hAnsi="Consolas" w:cs="Consolas"/>
@@ -5831,7 +5627,6 @@
         </w:rPr>
         <w:t>return</w:t>
       </w:r>
-      <w:proofErr w:type="gramEnd"/>
       <w:r>
         <w:rPr>
           <w:rFonts w:ascii="Consolas" w:hAnsi="Consolas" w:cs="Consolas"/>
@@ -5839,27 +5634,7 @@
           <w:sz w:val="19"/>
           <w:szCs w:val="19"/>
         </w:rPr>
-        <w:t xml:space="preserve"> </w:t>
-      </w:r>
-      <w:proofErr w:type="gramStart"/>
-      <w:r>
-        <w:rPr>
-          <w:rFonts w:ascii="Consolas" w:hAnsi="Consolas" w:cs="Consolas"/>
-          <w:color w:val="000000"/>
-          <w:sz w:val="19"/>
-          <w:szCs w:val="19"/>
-        </w:rPr>
-        <w:t>View(</w:t>
-      </w:r>
-      <w:proofErr w:type="gramEnd"/>
-      <w:r>
-        <w:rPr>
-          <w:rFonts w:ascii="Consolas" w:hAnsi="Consolas" w:cs="Consolas"/>
-          <w:color w:val="000000"/>
-          <w:sz w:val="19"/>
-          <w:szCs w:val="19"/>
-        </w:rPr>
-        <w:t>);</w:t>
+        <w:t xml:space="preserve"> View();</w:t>
       </w:r>
     </w:p>
     <w:p>
@@ -5961,7 +5736,6 @@
         <w:t>LocalHost</w:t>
       </w:r>
       <w:proofErr w:type="spellEnd"/>
-      <w:proofErr w:type="gramStart"/>
       <w:r>
         <w:rPr>
           <w:b/>
@@ -5978,7 +5752,6 @@
         <w:t>nnnnn</w:t>
       </w:r>
       <w:proofErr w:type="spellEnd"/>
-      <w:proofErr w:type="gramEnd"/>
       <w:r>
         <w:rPr>
           <w:b/>
@@ -6141,15 +5914,7 @@
         <w:t>r</w:t>
       </w:r>
       <w:r>
-        <w:t xml:space="preserve"> (bouton droit sur </w:t>
-      </w:r>
-      <w:proofErr w:type="gramStart"/>
-      <w:r>
-        <w:t>Index(</w:t>
-      </w:r>
-      <w:proofErr w:type="gramEnd"/>
-      <w:r>
-        <w:t>)), View Razor vide</w:t>
+        <w:t xml:space="preserve"> (bouton droit sur Index()), View Razor vide</w:t>
       </w:r>
     </w:p>
     <w:p>
@@ -11994,7 +11759,6 @@
         </w:rPr>
         <w:t xml:space="preserve">    </w:t>
       </w:r>
-      <w:proofErr w:type="gramStart"/>
       <w:r>
         <w:rPr>
           <w:rFonts w:ascii="Consolas" w:hAnsi="Consolas" w:cs="Consolas"/>
@@ -12004,7 +11768,6 @@
         </w:rPr>
         <w:t>return</w:t>
       </w:r>
-      <w:proofErr w:type="gramEnd"/>
       <w:r>
         <w:rPr>
           <w:rFonts w:ascii="Consolas" w:hAnsi="Consolas" w:cs="Consolas"/>
@@ -12012,27 +11775,7 @@
           <w:sz w:val="19"/>
           <w:szCs w:val="19"/>
         </w:rPr>
-        <w:t xml:space="preserve"> </w:t>
-      </w:r>
-      <w:proofErr w:type="gramStart"/>
-      <w:r>
-        <w:rPr>
-          <w:rFonts w:ascii="Consolas" w:hAnsi="Consolas" w:cs="Consolas"/>
-          <w:color w:val="000000"/>
-          <w:sz w:val="19"/>
-          <w:szCs w:val="19"/>
-        </w:rPr>
-        <w:t>View(</w:t>
-      </w:r>
-      <w:proofErr w:type="gramEnd"/>
-      <w:r>
-        <w:rPr>
-          <w:rFonts w:ascii="Consolas" w:hAnsi="Consolas" w:cs="Consolas"/>
-          <w:color w:val="000000"/>
-          <w:sz w:val="19"/>
-          <w:szCs w:val="19"/>
-        </w:rPr>
-        <w:t>);</w:t>
+        <w:t xml:space="preserve"> View();</w:t>
       </w:r>
     </w:p>
     <w:p>
@@ -12127,15 +11870,7 @@
         <w:t>ôleur</w:t>
       </w:r>
       <w:r>
-        <w:t xml:space="preserve"> (bouton droit sur </w:t>
-      </w:r>
-      <w:proofErr w:type="gramStart"/>
-      <w:r>
-        <w:t>Index(</w:t>
-      </w:r>
-      <w:proofErr w:type="gramEnd"/>
-      <w:r>
-        <w:t>)), View Razor vide</w:t>
+        <w:t xml:space="preserve"> (bouton droit sur Index()), View Razor vide</w:t>
       </w:r>
     </w:p>
     <w:p>
@@ -12310,16 +12045,11 @@
         </w:numPr>
         <w:spacing w:before="0" w:after="160" w:line="259" w:lineRule="auto"/>
       </w:pPr>
-      <w:proofErr w:type="gramStart"/>
       <w:r>
         <w:t>Modifiez</w:t>
       </w:r>
       <w:r>
-        <w:t xml:space="preserve"> le</w:t>
-      </w:r>
-      <w:proofErr w:type="gramEnd"/>
-      <w:r>
-        <w:t xml:space="preserve"> _Layout</w:t>
+        <w:t xml:space="preserve"> le _Layout</w:t>
       </w:r>
     </w:p>
     <w:p>
@@ -12917,29 +12647,7 @@
           <w:szCs w:val="19"/>
           <w:lang w:val="en-US"/>
         </w:rPr>
-        <w:t xml:space="preserve"> </w:t>
-      </w:r>
-      <w:proofErr w:type="gramStart"/>
-      <w:r>
-        <w:rPr>
-          <w:rFonts w:ascii="Consolas" w:hAnsi="Consolas" w:cs="Consolas"/>
-          <w:color w:val="000000"/>
-          <w:sz w:val="19"/>
-          <w:szCs w:val="19"/>
-          <w:lang w:val="en-US"/>
-        </w:rPr>
-        <w:t>View(</w:t>
-      </w:r>
-      <w:proofErr w:type="gramEnd"/>
-      <w:r>
-        <w:rPr>
-          <w:rFonts w:ascii="Consolas" w:hAnsi="Consolas" w:cs="Consolas"/>
-          <w:color w:val="000000"/>
-          <w:sz w:val="19"/>
-          <w:szCs w:val="19"/>
-          <w:lang w:val="en-US"/>
-        </w:rPr>
-        <w:t>);</w:t>
+        <w:t xml:space="preserve"> View();</w:t>
       </w:r>
     </w:p>
     <w:p>
@@ -13125,17 +12833,20 @@
         <w:t xml:space="preserve"> (bouton droit sur </w:t>
       </w:r>
       <w:proofErr w:type="spellStart"/>
-      <w:proofErr w:type="gramStart"/>
       <w:r>
         <w:t>Create</w:t>
       </w:r>
       <w:proofErr w:type="spellEnd"/>
       <w:r>
-        <w:t>(</w:t>
-      </w:r>
-      <w:proofErr w:type="gramEnd"/>
-      <w:r>
-        <w:t>)), View Razor vide</w:t>
+        <w:t xml:space="preserve">()), </w:t>
+      </w:r>
+      <w:proofErr w:type="spellStart"/>
+      <w:r>
+        <w:t>View</w:t>
+      </w:r>
+      <w:proofErr w:type="spellEnd"/>
+      <w:r>
+        <w:t xml:space="preserve"> Razor vide</w:t>
       </w:r>
     </w:p>
     <w:p>
@@ -13335,11 +13046,9 @@
         </w:numPr>
         <w:spacing w:before="0" w:after="160" w:line="259" w:lineRule="auto"/>
       </w:pPr>
-      <w:proofErr w:type="gramStart"/>
       <w:r>
         <w:t>le</w:t>
       </w:r>
-      <w:proofErr w:type="gramEnd"/>
       <w:r>
         <w:t xml:space="preserve"> </w:t>
       </w:r>
@@ -13349,6 +13058,13 @@
           <w:bCs/>
         </w:rPr>
         <w:t>formulaire</w:t>
+      </w:r>
+      <w:r>
+        <w:rPr>
+          <w:b/>
+          <w:bCs/>
+        </w:rPr>
+        <w:t xml:space="preserve"> ?</w:t>
       </w:r>
     </w:p>
     <w:p>
@@ -13360,13 +13076,8 @@
         </w:numPr>
         <w:spacing w:before="0" w:after="160" w:line="259" w:lineRule="auto"/>
       </w:pPr>
-      <w:proofErr w:type="gramStart"/>
-      <w:r>
-        <w:t>le</w:t>
-      </w:r>
-      <w:proofErr w:type="gramEnd"/>
-      <w:r>
-        <w:t xml:space="preserve"> </w:t>
+      <w:r>
+        <w:t xml:space="preserve">le </w:t>
       </w:r>
       <w:r>
         <w:rPr>
@@ -13388,14 +13099,12 @@
         </w:numPr>
         <w:spacing w:before="0" w:after="160" w:line="259" w:lineRule="auto"/>
       </w:pPr>
-      <w:proofErr w:type="gramStart"/>
       <w:r>
         <w:t>l</w:t>
       </w:r>
       <w:r>
         <w:t>a</w:t>
       </w:r>
-      <w:proofErr w:type="gramEnd"/>
       <w:r>
         <w:t xml:space="preserve"> </w:t>
       </w:r>
@@ -13419,13 +13128,8 @@
         </w:numPr>
         <w:spacing w:before="0" w:after="160" w:line="259" w:lineRule="auto"/>
       </w:pPr>
-      <w:proofErr w:type="gramStart"/>
-      <w:r>
-        <w:t>le</w:t>
-      </w:r>
-      <w:proofErr w:type="gramEnd"/>
-      <w:r>
-        <w:t xml:space="preserve"> </w:t>
+      <w:r>
+        <w:t xml:space="preserve">le </w:t>
       </w:r>
       <w:r>
         <w:t>bouton</w:t>
@@ -14494,7 +14198,6 @@
         </w:rPr>
         <w:t xml:space="preserve">    </w:t>
       </w:r>
-      <w:proofErr w:type="gramStart"/>
       <w:r>
         <w:rPr>
           <w:rFonts w:ascii="Cascadia Mono" w:hAnsi="Cascadia Mono" w:cs="Cascadia Mono"/>
@@ -14504,7 +14207,6 @@
         </w:rPr>
         <w:t>if</w:t>
       </w:r>
-      <w:proofErr w:type="gramEnd"/>
       <w:r>
         <w:rPr>
           <w:rFonts w:ascii="Cascadia Mono" w:hAnsi="Cascadia Mono" w:cs="Cascadia Mono"/>
@@ -14698,7 +14400,6 @@
         </w:rPr>
         <w:t xml:space="preserve">    </w:t>
       </w:r>
-      <w:proofErr w:type="gramStart"/>
       <w:r>
         <w:rPr>
           <w:rFonts w:ascii="Cascadia Mono" w:hAnsi="Cascadia Mono" w:cs="Cascadia Mono"/>
@@ -14708,7 +14409,6 @@
         </w:rPr>
         <w:t>return</w:t>
       </w:r>
-      <w:proofErr w:type="gramEnd"/>
       <w:r>
         <w:rPr>
           <w:rFonts w:ascii="Cascadia Mono" w:hAnsi="Cascadia Mono" w:cs="Cascadia Mono"/>
@@ -14719,7 +14419,6 @@
         <w:t xml:space="preserve"> </w:t>
       </w:r>
       <w:proofErr w:type="spellStart"/>
-      <w:proofErr w:type="gramStart"/>
       <w:r>
         <w:rPr>
           <w:rFonts w:ascii="Cascadia Mono" w:hAnsi="Cascadia Mono" w:cs="Cascadia Mono"/>
@@ -14739,7 +14438,6 @@
         <w:t>.View</w:t>
       </w:r>
       <w:proofErr w:type="spellEnd"/>
-      <w:proofErr w:type="gramEnd"/>
       <w:r>
         <w:rPr>
           <w:rFonts w:ascii="Cascadia Mono" w:hAnsi="Cascadia Mono" w:cs="Cascadia Mono"/>
@@ -16012,29 +15710,7 @@
           <w:szCs w:val="19"/>
           <w:lang w:val="en-US"/>
         </w:rPr>
-        <w:t xml:space="preserve">@section </w:t>
-      </w:r>
-      <w:proofErr w:type="gramStart"/>
-      <w:r>
-        <w:rPr>
-          <w:rFonts w:ascii="Cascadia Mono" w:hAnsi="Cascadia Mono" w:cs="Cascadia Mono"/>
-          <w:color w:val="000000"/>
-          <w:sz w:val="19"/>
-          <w:szCs w:val="19"/>
-          <w:lang w:val="en-US"/>
-        </w:rPr>
-        <w:t>Scripts{</w:t>
-      </w:r>
-      <w:proofErr w:type="gramEnd"/>
-      <w:r>
-        <w:rPr>
-          <w:rFonts w:ascii="Cascadia Mono" w:hAnsi="Cascadia Mono" w:cs="Cascadia Mono"/>
-          <w:color w:val="000000"/>
-          <w:sz w:val="19"/>
-          <w:szCs w:val="19"/>
-          <w:lang w:val="en-US"/>
-        </w:rPr>
-        <w:t xml:space="preserve"> </w:t>
+        <w:t xml:space="preserve">@section Scripts{ </w:t>
       </w:r>
     </w:p>
     <w:p>
@@ -16067,18 +15743,51 @@
           <w:szCs w:val="19"/>
           <w:lang w:val="en-US"/>
         </w:rPr>
-        <w:t xml:space="preserve">    </w:t>
-      </w:r>
-      <w:proofErr w:type="gramStart"/>
-      <w:r>
-        <w:rPr>
-          <w:rFonts w:ascii="Cascadia Mono" w:hAnsi="Cascadia Mono" w:cs="Cascadia Mono"/>
-          <w:color w:val="000000"/>
+        <w:t xml:space="preserve">    @{ </w:t>
+      </w:r>
+      <w:r>
+        <w:rPr>
+          <w:rFonts w:ascii="Cascadia Mono" w:hAnsi="Cascadia Mono" w:cs="Cascadia Mono"/>
+          <w:color w:val="0000FF"/>
           <w:sz w:val="19"/>
           <w:szCs w:val="19"/>
           <w:lang w:val="en-US"/>
         </w:rPr>
-        <w:t xml:space="preserve">@{ </w:t>
+        <w:t>&lt;</w:t>
+      </w:r>
+      <w:r>
+        <w:rPr>
+          <w:rFonts w:ascii="Cascadia Mono" w:hAnsi="Cascadia Mono" w:cs="Cascadia Mono"/>
+          <w:b/>
+          <w:bCs/>
+          <w:color w:val="800080"/>
+          <w:sz w:val="19"/>
+          <w:szCs w:val="19"/>
+          <w:lang w:val="en-US"/>
+        </w:rPr>
+        <w:t>partial</w:t>
+      </w:r>
+      <w:r>
+        <w:rPr>
+          <w:rFonts w:ascii="Cascadia Mono" w:hAnsi="Cascadia Mono" w:cs="Cascadia Mono"/>
+          <w:color w:val="000000"/>
+          <w:sz w:val="19"/>
+          <w:szCs w:val="19"/>
+          <w:lang w:val="en-US"/>
+        </w:rPr>
+        <w:t xml:space="preserve"> </w:t>
+      </w:r>
+      <w:r>
+        <w:rPr>
+          <w:rFonts w:ascii="Cascadia Mono" w:hAnsi="Cascadia Mono" w:cs="Cascadia Mono"/>
+          <w:b/>
+          <w:bCs/>
+          <w:color w:val="800080"/>
+          <w:sz w:val="19"/>
+          <w:szCs w:val="19"/>
+          <w:lang w:val="en-US"/>
+        </w:rPr>
+        <w:t>name</w:t>
       </w:r>
       <w:r>
         <w:rPr>
@@ -16088,117 +15797,60 @@
           <w:szCs w:val="19"/>
           <w:lang w:val="en-US"/>
         </w:rPr>
-        <w:t>&lt;</w:t>
-      </w:r>
-      <w:proofErr w:type="gramEnd"/>
-      <w:r>
-        <w:rPr>
-          <w:rFonts w:ascii="Cascadia Mono" w:hAnsi="Cascadia Mono" w:cs="Cascadia Mono"/>
-          <w:b/>
-          <w:bCs/>
-          <w:color w:val="800080"/>
+        <w:t>="_</w:t>
+      </w:r>
+      <w:proofErr w:type="spellStart"/>
+      <w:r>
+        <w:rPr>
+          <w:rFonts w:ascii="Cascadia Mono" w:hAnsi="Cascadia Mono" w:cs="Cascadia Mono"/>
+          <w:color w:val="0000FF"/>
           <w:sz w:val="19"/>
           <w:szCs w:val="19"/>
           <w:lang w:val="en-US"/>
         </w:rPr>
-        <w:t>partial</w:t>
-      </w:r>
-      <w:r>
-        <w:rPr>
-          <w:rFonts w:ascii="Cascadia Mono" w:hAnsi="Cascadia Mono" w:cs="Cascadia Mono"/>
-          <w:color w:val="000000"/>
+        <w:t>ValidationScriptsPartial</w:t>
+      </w:r>
+      <w:proofErr w:type="spellEnd"/>
+      <w:r>
+        <w:rPr>
+          <w:rFonts w:ascii="Cascadia Mono" w:hAnsi="Cascadia Mono" w:cs="Cascadia Mono"/>
+          <w:color w:val="0000FF"/>
           <w:sz w:val="19"/>
           <w:szCs w:val="19"/>
           <w:lang w:val="en-US"/>
         </w:rPr>
+        <w:t>"</w:t>
+      </w:r>
+      <w:r>
+        <w:rPr>
+          <w:rFonts w:ascii="Cascadia Mono" w:hAnsi="Cascadia Mono" w:cs="Cascadia Mono"/>
+          <w:color w:val="000000"/>
+          <w:sz w:val="19"/>
+          <w:szCs w:val="19"/>
+          <w:lang w:val="en-US"/>
+        </w:rPr>
         <w:t xml:space="preserve"> </w:t>
       </w:r>
       <w:r>
         <w:rPr>
           <w:rFonts w:ascii="Cascadia Mono" w:hAnsi="Cascadia Mono" w:cs="Cascadia Mono"/>
-          <w:b/>
-          <w:bCs/>
-          <w:color w:val="800080"/>
+          <w:color w:val="0000FF"/>
           <w:sz w:val="19"/>
           <w:szCs w:val="19"/>
           <w:lang w:val="en-US"/>
         </w:rPr>
-        <w:t>name</w:t>
-      </w:r>
-      <w:r>
-        <w:rPr>
-          <w:rFonts w:ascii="Cascadia Mono" w:hAnsi="Cascadia Mono" w:cs="Cascadia Mono"/>
-          <w:color w:val="0000FF"/>
+        <w:t>/&gt;</w:t>
+      </w:r>
+      <w:r>
+        <w:rPr>
+          <w:rFonts w:ascii="Cascadia Mono" w:hAnsi="Cascadia Mono" w:cs="Cascadia Mono"/>
+          <w:color w:val="000000"/>
           <w:sz w:val="19"/>
           <w:szCs w:val="19"/>
           <w:lang w:val="en-US"/>
         </w:rPr>
-        <w:t>="_</w:t>
-      </w:r>
-      <w:proofErr w:type="spellStart"/>
-      <w:r>
-        <w:rPr>
-          <w:rFonts w:ascii="Cascadia Mono" w:hAnsi="Cascadia Mono" w:cs="Cascadia Mono"/>
-          <w:color w:val="0000FF"/>
-          <w:sz w:val="19"/>
-          <w:szCs w:val="19"/>
-          <w:lang w:val="en-US"/>
-        </w:rPr>
-        <w:t>ValidationScriptsPartial</w:t>
-      </w:r>
-      <w:proofErr w:type="spellEnd"/>
-      <w:r>
-        <w:rPr>
-          <w:rFonts w:ascii="Cascadia Mono" w:hAnsi="Cascadia Mono" w:cs="Cascadia Mono"/>
-          <w:color w:val="0000FF"/>
-          <w:sz w:val="19"/>
-          <w:szCs w:val="19"/>
-          <w:lang w:val="en-US"/>
-        </w:rPr>
-        <w:t>"</w:t>
-      </w:r>
-      <w:r>
-        <w:rPr>
-          <w:rFonts w:ascii="Cascadia Mono" w:hAnsi="Cascadia Mono" w:cs="Cascadia Mono"/>
-          <w:color w:val="000000"/>
-          <w:sz w:val="19"/>
-          <w:szCs w:val="19"/>
-          <w:lang w:val="en-US"/>
-        </w:rPr>
-        <w:t xml:space="preserve"> </w:t>
-      </w:r>
-      <w:r>
-        <w:rPr>
-          <w:rFonts w:ascii="Cascadia Mono" w:hAnsi="Cascadia Mono" w:cs="Cascadia Mono"/>
-          <w:color w:val="0000FF"/>
-          <w:sz w:val="19"/>
-          <w:szCs w:val="19"/>
-          <w:lang w:val="en-US"/>
-        </w:rPr>
-        <w:t>/</w:t>
-      </w:r>
-      <w:proofErr w:type="gramStart"/>
-      <w:r>
-        <w:rPr>
-          <w:rFonts w:ascii="Cascadia Mono" w:hAnsi="Cascadia Mono" w:cs="Cascadia Mono"/>
-          <w:color w:val="0000FF"/>
-          <w:sz w:val="19"/>
-          <w:szCs w:val="19"/>
-          <w:lang w:val="en-US"/>
-        </w:rPr>
-        <w:t>&gt;</w:t>
-      </w:r>
-      <w:r>
-        <w:rPr>
-          <w:rFonts w:ascii="Cascadia Mono" w:hAnsi="Cascadia Mono" w:cs="Cascadia Mono"/>
-          <w:color w:val="000000"/>
-          <w:sz w:val="19"/>
-          <w:szCs w:val="19"/>
-          <w:lang w:val="en-US"/>
-        </w:rPr>
         <w:t xml:space="preserve"> }</w:t>
       </w:r>
-      <w:proofErr w:type="gramEnd"/>
     </w:p>
     <w:p>
       <w:pPr>
@@ -16861,7 +16513,7 @@
 </file>
 
 <file path=word/endnotes.xml><?xml version="1.0" encoding="utf-8"?>
-<w:endnotes xmlns:wpc="http://schemas.microsoft.com/office/word/2010/wordprocessingCanvas" xmlns:cx="http://schemas.microsoft.com/office/drawing/2014/chartex" xmlns:cx1="http://schemas.microsoft.com/office/drawing/2015/9/8/chartex" xmlns:cx2="http://schemas.microsoft.com/office/drawing/2015/10/21/chartex" xmlns:cx3="http://schemas.microsoft.com/office/drawing/2016/5/9/chartex" xmlns:cx4="http://schemas.microsoft.com/office/drawing/2016/5/10/chartex" xmlns:cx5="http://schemas.microsoft.com/office/drawing/2016/5/11/chartex" xmlns:cx6="http://schemas.microsoft.com/office/drawing/2016/5/12/chartex" xmlns:cx7="http://schemas.microsoft.com/office/drawing/2016/5/13/chartex" xmlns:cx8="http://schemas.microsoft.com/office/drawing/2016/5/14/chartex" xmlns:mc="http://schemas.openxmlformats.org/markup-compatibility/2006" xmlns:aink="http://schemas.microsoft.com/office/drawing/2016/ink" xmlns:am3d="http://schemas.microsoft.com/office/drawing/2017/model3d" xmlns:o="urn:schemas-microsoft-com:office:office" xmlns:oel="http://schemas.microsoft.com/office/2019/extlst" xmlns:r="http://schemas.openxmlformats.org/officeDocument/2006/relationships" xmlns:m="http://schemas.openxmlformats.org/officeDocument/2006/math" xmlns:v="urn:schemas-microsoft-com:vml" xmlns:wp14="http://schemas.microsoft.com/office/word/2010/wordprocessingDrawing" xmlns:wp="http://schemas.openxmlformats.org/drawingml/2006/wordprocessingDrawing" xmlns:w10="urn:schemas-microsoft-com:office:word" xmlns:w="http://schemas.openxmlformats.org/wordprocessingml/2006/main" xmlns:w14="http://schemas.microsoft.com/office/word/2010/wordml" xmlns:w15="http://schemas.microsoft.com/office/word/2012/wordml" xmlns:w16cex="http://schemas.microsoft.com/office/word/2018/wordml/cex" xmlns:w16cid="http://schemas.microsoft.com/office/word/2016/wordml/cid" xmlns:w16="http://schemas.microsoft.com/office/word/2018/wordml" xmlns:w16du="http://schemas.microsoft.com/office/word/2023/wordml/word16du" xmlns:w16sdtdh="http://schemas.microsoft.com/office/word/2020/wordml/sdtdatahash" xmlns:w16sdtfl="http://schemas.microsoft.com/office/word/2024/wordml/sdtformatlock" xmlns:w16se="http://schemas.microsoft.com/office/word/2015/wordml/symex" xmlns:wpg="http://schemas.microsoft.com/office/word/2010/wordprocessingGroup" xmlns:wpi="http://schemas.microsoft.com/office/word/2010/wordprocessingInk" xmlns:wne="http://schemas.microsoft.com/office/word/2006/wordml" xmlns:wps="http://schemas.microsoft.com/office/word/2010/wordprocessingShape" mc:Ignorable="w14 w15 w16se w16cid w16 w16cex w16sdtdh w16sdtfl w16du wp14">
+<w:endnotes xmlns:wpc="http://schemas.microsoft.com/office/word/2010/wordprocessingCanvas" xmlns:cx="http://schemas.microsoft.com/office/drawing/2014/chartex" xmlns:cx1="http://schemas.microsoft.com/office/drawing/2015/9/8/chartex" xmlns:cx2="http://schemas.microsoft.com/office/drawing/2015/10/21/chartex" xmlns:cx3="http://schemas.microsoft.com/office/drawing/2016/5/9/chartex" xmlns:cx4="http://schemas.microsoft.com/office/drawing/2016/5/10/chartex" xmlns:cx5="http://schemas.microsoft.com/office/drawing/2016/5/11/chartex" xmlns:cx6="http://schemas.microsoft.com/office/drawing/2016/5/12/chartex" xmlns:cx7="http://schemas.microsoft.com/office/drawing/2016/5/13/chartex" xmlns:cx8="http://schemas.microsoft.com/office/drawing/2016/5/14/chartex" xmlns:mc="http://schemas.openxmlformats.org/markup-compatibility/2006" xmlns:aink="http://schemas.microsoft.com/office/drawing/2016/ink" xmlns:am3d="http://schemas.microsoft.com/office/drawing/2017/model3d" xmlns:o="urn:schemas-microsoft-com:office:office" xmlns:oel="http://schemas.microsoft.com/office/2019/extlst" xmlns:r="http://schemas.openxmlformats.org/officeDocument/2006/relationships" xmlns:m="http://schemas.openxmlformats.org/officeDocument/2006/math" xmlns:v="urn:schemas-microsoft-com:vml" xmlns:wp14="http://schemas.microsoft.com/office/word/2010/wordprocessingDrawing" xmlns:wp="http://schemas.openxmlformats.org/drawingml/2006/wordprocessingDrawing" xmlns:w10="urn:schemas-microsoft-com:office:word" xmlns:w="http://schemas.openxmlformats.org/wordprocessingml/2006/main" xmlns:w14="http://schemas.microsoft.com/office/word/2010/wordml" xmlns:w15="http://schemas.microsoft.com/office/word/2012/wordml" xmlns:w16cei="http://schemas.microsoft.com/office/word/2026/wordml/cei" xmlns:w16cex="http://schemas.microsoft.com/office/word/2018/wordml/cex" xmlns:w16cid="http://schemas.microsoft.com/office/word/2016/wordml/cid" xmlns:w16="http://schemas.microsoft.com/office/word/2018/wordml" xmlns:w16du="http://schemas.microsoft.com/office/word/2023/wordml/word16du" xmlns:w16sdtdh="http://schemas.microsoft.com/office/word/2020/wordml/sdtdatahash" xmlns:w16sdtfl="http://schemas.microsoft.com/office/word/2024/wordml/sdtformatlock" xmlns:w16se="http://schemas.microsoft.com/office/word/2015/wordml/symex" xmlns:wpg="http://schemas.microsoft.com/office/word/2010/wordprocessingGroup" xmlns:wpi="http://schemas.microsoft.com/office/word/2010/wordprocessingInk" xmlns:wne="http://schemas.microsoft.com/office/word/2006/wordml" xmlns:wps="http://schemas.microsoft.com/office/word/2010/wordprocessingShape" mc:Ignorable="w14 w15 w16se w16cid w16 w16cex w16sdtdh w16sdtfl w16du wp14">
   <w:endnote w:type="separator" w:id="-1">
     <w:p>
       <w:r>
@@ -16880,7 +16532,7 @@
 </file>
 
 <file path=word/footer1.xml><?xml version="1.0" encoding="utf-8"?>
-<w:ftr xmlns:wpc="http://schemas.microsoft.com/office/word/2010/wordprocessingCanvas" xmlns:cx="http://schemas.microsoft.com/office/drawing/2014/chartex" xmlns:cx1="http://schemas.microsoft.com/office/drawing/2015/9/8/chartex" xmlns:cx2="http://schemas.microsoft.com/office/drawing/2015/10/21/chartex" xmlns:cx3="http://schemas.microsoft.com/office/drawing/2016/5/9/chartex" xmlns:cx4="http://schemas.microsoft.com/office/drawing/2016/5/10/chartex" xmlns:cx5="http://schemas.microsoft.com/office/drawing/2016/5/11/chartex" xmlns:cx6="http://schemas.microsoft.com/office/drawing/2016/5/12/chartex" xmlns:cx7="http://schemas.microsoft.com/office/drawing/2016/5/13/chartex" xmlns:cx8="http://schemas.microsoft.com/office/drawing/2016/5/14/chartex" xmlns:mc="http://schemas.openxmlformats.org/markup-compatibility/2006" xmlns:aink="http://schemas.microsoft.com/office/drawing/2016/ink" xmlns:am3d="http://schemas.microsoft.com/office/drawing/2017/model3d" xmlns:o="urn:schemas-microsoft-com:office:office" xmlns:oel="http://schemas.microsoft.com/office/2019/extlst" xmlns:r="http://schemas.openxmlformats.org/officeDocument/2006/relationships" xmlns:m="http://schemas.openxmlformats.org/officeDocument/2006/math" xmlns:v="urn:schemas-microsoft-com:vml" xmlns:wp14="http://schemas.microsoft.com/office/word/2010/wordprocessingDrawing" xmlns:wp="http://schemas.openxmlformats.org/drawingml/2006/wordprocessingDrawing" xmlns:w10="urn:schemas-microsoft-com:office:word" xmlns:w="http://schemas.openxmlformats.org/wordprocessingml/2006/main" xmlns:w14="http://schemas.microsoft.com/office/word/2010/wordml" xmlns:w15="http://schemas.microsoft.com/office/word/2012/wordml" xmlns:w16cex="http://schemas.microsoft.com/office/word/2018/wordml/cex" xmlns:w16cid="http://schemas.microsoft.com/office/word/2016/wordml/cid" xmlns:w16="http://schemas.microsoft.com/office/word/2018/wordml" xmlns:w16du="http://schemas.microsoft.com/office/word/2023/wordml/word16du" xmlns:w16sdtdh="http://schemas.microsoft.com/office/word/2020/wordml/sdtdatahash" xmlns:w16sdtfl="http://schemas.microsoft.com/office/word/2024/wordml/sdtformatlock" xmlns:w16se="http://schemas.microsoft.com/office/word/2015/wordml/symex" xmlns:wpg="http://schemas.microsoft.com/office/word/2010/wordprocessingGroup" xmlns:wpi="http://schemas.microsoft.com/office/word/2010/wordprocessingInk" xmlns:wne="http://schemas.microsoft.com/office/word/2006/wordml" xmlns:wps="http://schemas.microsoft.com/office/word/2010/wordprocessingShape" mc:Ignorable="w14 w15 w16se w16cid w16 w16cex w16sdtdh w16sdtfl w16du wp14">
+<w:ftr xmlns:wpc="http://schemas.microsoft.com/office/word/2010/wordprocessingCanvas" xmlns:cx="http://schemas.microsoft.com/office/drawing/2014/chartex" xmlns:cx1="http://schemas.microsoft.com/office/drawing/2015/9/8/chartex" xmlns:cx2="http://schemas.microsoft.com/office/drawing/2015/10/21/chartex" xmlns:cx3="http://schemas.microsoft.com/office/drawing/2016/5/9/chartex" xmlns:cx4="http://schemas.microsoft.com/office/drawing/2016/5/10/chartex" xmlns:cx5="http://schemas.microsoft.com/office/drawing/2016/5/11/chartex" xmlns:cx6="http://schemas.microsoft.com/office/drawing/2016/5/12/chartex" xmlns:cx7="http://schemas.microsoft.com/office/drawing/2016/5/13/chartex" xmlns:cx8="http://schemas.microsoft.com/office/drawing/2016/5/14/chartex" xmlns:mc="http://schemas.openxmlformats.org/markup-compatibility/2006" xmlns:aink="http://schemas.microsoft.com/office/drawing/2016/ink" xmlns:am3d="http://schemas.microsoft.com/office/drawing/2017/model3d" xmlns:o="urn:schemas-microsoft-com:office:office" xmlns:oel="http://schemas.microsoft.com/office/2019/extlst" xmlns:r="http://schemas.openxmlformats.org/officeDocument/2006/relationships" xmlns:m="http://schemas.openxmlformats.org/officeDocument/2006/math" xmlns:v="urn:schemas-microsoft-com:vml" xmlns:wp14="http://schemas.microsoft.com/office/word/2010/wordprocessingDrawing" xmlns:wp="http://schemas.openxmlformats.org/drawingml/2006/wordprocessingDrawing" xmlns:w10="urn:schemas-microsoft-com:office:word" xmlns:w="http://schemas.openxmlformats.org/wordprocessingml/2006/main" xmlns:w14="http://schemas.microsoft.com/office/word/2010/wordml" xmlns:w15="http://schemas.microsoft.com/office/word/2012/wordml" xmlns:w16cei="http://schemas.microsoft.com/office/word/2026/wordml/cei" xmlns:w16cex="http://schemas.microsoft.com/office/word/2018/wordml/cex" xmlns:w16cid="http://schemas.microsoft.com/office/word/2016/wordml/cid" xmlns:w16="http://schemas.microsoft.com/office/word/2018/wordml" xmlns:w16du="http://schemas.microsoft.com/office/word/2023/wordml/word16du" xmlns:w16sdtdh="http://schemas.microsoft.com/office/word/2020/wordml/sdtdatahash" xmlns:w16sdtfl="http://schemas.microsoft.com/office/word/2024/wordml/sdtformatlock" xmlns:w16se="http://schemas.microsoft.com/office/word/2015/wordml/symex" xmlns:wpg="http://schemas.microsoft.com/office/word/2010/wordprocessingGroup" xmlns:wpi="http://schemas.microsoft.com/office/word/2010/wordprocessingInk" xmlns:wne="http://schemas.microsoft.com/office/word/2006/wordml" xmlns:wps="http://schemas.microsoft.com/office/word/2010/wordprocessingShape" mc:Ignorable="w14 w15 w16se w16cid w16 w16cex w16sdtdh w16sdtfl w16du wp14">
   <w:p>
     <w:pPr>
       <w:pStyle w:val="Pieddepage"/>
@@ -16933,7 +16585,7 @@
 </file>
 
 <file path=word/footnotes.xml><?xml version="1.0" encoding="utf-8"?>
-<w:footnotes xmlns:wpc="http://schemas.microsoft.com/office/word/2010/wordprocessingCanvas" xmlns:cx="http://schemas.microsoft.com/office/drawing/2014/chartex" xmlns:cx1="http://schemas.microsoft.com/office/drawing/2015/9/8/chartex" xmlns:cx2="http://schemas.microsoft.com/office/drawing/2015/10/21/chartex" xmlns:cx3="http://schemas.microsoft.com/office/drawing/2016/5/9/chartex" xmlns:cx4="http://schemas.microsoft.com/office/drawing/2016/5/10/chartex" xmlns:cx5="http://schemas.microsoft.com/office/drawing/2016/5/11/chartex" xmlns:cx6="http://schemas.microsoft.com/office/drawing/2016/5/12/chartex" xmlns:cx7="http://schemas.microsoft.com/office/drawing/2016/5/13/chartex" xmlns:cx8="http://schemas.microsoft.com/office/drawing/2016/5/14/chartex" xmlns:mc="http://schemas.openxmlformats.org/markup-compatibility/2006" xmlns:aink="http://schemas.microsoft.com/office/drawing/2016/ink" xmlns:am3d="http://schemas.microsoft.com/office/drawing/2017/model3d" xmlns:o="urn:schemas-microsoft-com:office:office" xmlns:oel="http://schemas.microsoft.com/office/2019/extlst" xmlns:r="http://schemas.openxmlformats.org/officeDocument/2006/relationships" xmlns:m="http://schemas.openxmlformats.org/officeDocument/2006/math" xmlns:v="urn:schemas-microsoft-com:vml" xmlns:wp14="http://schemas.microsoft.com/office/word/2010/wordprocessingDrawing" xmlns:wp="http://schemas.openxmlformats.org/drawingml/2006/wordprocessingDrawing" xmlns:w10="urn:schemas-microsoft-com:office:word" xmlns:w="http://schemas.openxmlformats.org/wordprocessingml/2006/main" xmlns:w14="http://schemas.microsoft.com/office/word/2010/wordml" xmlns:w15="http://schemas.microsoft.com/office/word/2012/wordml" xmlns:w16cex="http://schemas.microsoft.com/office/word/2018/wordml/cex" xmlns:w16cid="http://schemas.microsoft.com/office/word/2016/wordml/cid" xmlns:w16="http://schemas.microsoft.com/office/word/2018/wordml" xmlns:w16du="http://schemas.microsoft.com/office/word/2023/wordml/word16du" xmlns:w16sdtdh="http://schemas.microsoft.com/office/word/2020/wordml/sdtdatahash" xmlns:w16sdtfl="http://schemas.microsoft.com/office/word/2024/wordml/sdtformatlock" xmlns:w16se="http://schemas.microsoft.com/office/word/2015/wordml/symex" xmlns:wpg="http://schemas.microsoft.com/office/word/2010/wordprocessingGroup" xmlns:wpi="http://schemas.microsoft.com/office/word/2010/wordprocessingInk" xmlns:wne="http://schemas.microsoft.com/office/word/2006/wordml" xmlns:wps="http://schemas.microsoft.com/office/word/2010/wordprocessingShape" mc:Ignorable="w14 w15 w16se w16cid w16 w16cex w16sdtdh w16sdtfl w16du wp14">
+<w:footnotes xmlns:wpc="http://schemas.microsoft.com/office/word/2010/wordprocessingCanvas" xmlns:cx="http://schemas.microsoft.com/office/drawing/2014/chartex" xmlns:cx1="http://schemas.microsoft.com/office/drawing/2015/9/8/chartex" xmlns:cx2="http://schemas.microsoft.com/office/drawing/2015/10/21/chartex" xmlns:cx3="http://schemas.microsoft.com/office/drawing/2016/5/9/chartex" xmlns:cx4="http://schemas.microsoft.com/office/drawing/2016/5/10/chartex" xmlns:cx5="http://schemas.microsoft.com/office/drawing/2016/5/11/chartex" xmlns:cx6="http://schemas.microsoft.com/office/drawing/2016/5/12/chartex" xmlns:cx7="http://schemas.microsoft.com/office/drawing/2016/5/13/chartex" xmlns:cx8="http://schemas.microsoft.com/office/drawing/2016/5/14/chartex" xmlns:mc="http://schemas.openxmlformats.org/markup-compatibility/2006" xmlns:aink="http://schemas.microsoft.com/office/drawing/2016/ink" xmlns:am3d="http://schemas.microsoft.com/office/drawing/2017/model3d" xmlns:o="urn:schemas-microsoft-com:office:office" xmlns:oel="http://schemas.microsoft.com/office/2019/extlst" xmlns:r="http://schemas.openxmlformats.org/officeDocument/2006/relationships" xmlns:m="http://schemas.openxmlformats.org/officeDocument/2006/math" xmlns:v="urn:schemas-microsoft-com:vml" xmlns:wp14="http://schemas.microsoft.com/office/word/2010/wordprocessingDrawing" xmlns:wp="http://schemas.openxmlformats.org/drawingml/2006/wordprocessingDrawing" xmlns:w10="urn:schemas-microsoft-com:office:word" xmlns:w="http://schemas.openxmlformats.org/wordprocessingml/2006/main" xmlns:w14="http://schemas.microsoft.com/office/word/2010/wordml" xmlns:w15="http://schemas.microsoft.com/office/word/2012/wordml" xmlns:w16cei="http://schemas.microsoft.com/office/word/2026/wordml/cei" xmlns:w16cex="http://schemas.microsoft.com/office/word/2018/wordml/cex" xmlns:w16cid="http://schemas.microsoft.com/office/word/2016/wordml/cid" xmlns:w16="http://schemas.microsoft.com/office/word/2018/wordml" xmlns:w16du="http://schemas.microsoft.com/office/word/2023/wordml/word16du" xmlns:w16sdtdh="http://schemas.microsoft.com/office/word/2020/wordml/sdtdatahash" xmlns:w16sdtfl="http://schemas.microsoft.com/office/word/2024/wordml/sdtformatlock" xmlns:w16se="http://schemas.microsoft.com/office/word/2015/wordml/symex" xmlns:wpg="http://schemas.microsoft.com/office/word/2010/wordprocessingGroup" xmlns:wpi="http://schemas.microsoft.com/office/word/2010/wordprocessingInk" xmlns:wne="http://schemas.microsoft.com/office/word/2006/wordml" xmlns:wps="http://schemas.microsoft.com/office/word/2010/wordprocessingShape" mc:Ignorable="w14 w15 w16se w16cid w16 w16cex w16sdtdh w16sdtfl w16du wp14">
   <w:footnote w:type="separator" w:id="-1">
     <w:p>
       <w:r>
@@ -16952,7 +16604,7 @@
 </file>
 
 <file path=word/header1.xml><?xml version="1.0" encoding="utf-8"?>
-<w:hdr xmlns:wpc="http://schemas.microsoft.com/office/word/2010/wordprocessingCanvas" xmlns:cx="http://schemas.microsoft.com/office/drawing/2014/chartex" xmlns:cx1="http://schemas.microsoft.com/office/drawing/2015/9/8/chartex" xmlns:cx2="http://schemas.microsoft.com/office/drawing/2015/10/21/chartex" xmlns:cx3="http://schemas.microsoft.com/office/drawing/2016/5/9/chartex" xmlns:cx4="http://schemas.microsoft.com/office/drawing/2016/5/10/chartex" xmlns:cx5="http://schemas.microsoft.com/office/drawing/2016/5/11/chartex" xmlns:cx6="http://schemas.microsoft.com/office/drawing/2016/5/12/chartex" xmlns:cx7="http://schemas.microsoft.com/office/drawing/2016/5/13/chartex" xmlns:cx8="http://schemas.microsoft.com/office/drawing/2016/5/14/chartex" xmlns:mc="http://schemas.openxmlformats.org/markup-compatibility/2006" xmlns:aink="http://schemas.microsoft.com/office/drawing/2016/ink" xmlns:am3d="http://schemas.microsoft.com/office/drawing/2017/model3d" xmlns:o="urn:schemas-microsoft-com:office:office" xmlns:oel="http://schemas.microsoft.com/office/2019/extlst" xmlns:r="http://schemas.openxmlformats.org/officeDocument/2006/relationships" xmlns:m="http://schemas.openxmlformats.org/officeDocument/2006/math" xmlns:v="urn:schemas-microsoft-com:vml" xmlns:wp14="http://schemas.microsoft.com/office/word/2010/wordprocessingDrawing" xmlns:wp="http://schemas.openxmlformats.org/drawingml/2006/wordprocessingDrawing" xmlns:w10="urn:schemas-microsoft-com:office:word" xmlns:w="http://schemas.openxmlformats.org/wordprocessingml/2006/main" xmlns:w14="http://schemas.microsoft.com/office/word/2010/wordml" xmlns:w15="http://schemas.microsoft.com/office/word/2012/wordml" xmlns:w16cex="http://schemas.microsoft.com/office/word/2018/wordml/cex" xmlns:w16cid="http://schemas.microsoft.com/office/word/2016/wordml/cid" xmlns:w16="http://schemas.microsoft.com/office/word/2018/wordml" xmlns:w16du="http://schemas.microsoft.com/office/word/2023/wordml/word16du" xmlns:w16sdtdh="http://schemas.microsoft.com/office/word/2020/wordml/sdtdatahash" xmlns:w16sdtfl="http://schemas.microsoft.com/office/word/2024/wordml/sdtformatlock" xmlns:w16se="http://schemas.microsoft.com/office/word/2015/wordml/symex" xmlns:wpg="http://schemas.microsoft.com/office/word/2010/wordprocessingGroup" xmlns:wpi="http://schemas.microsoft.com/office/word/2010/wordprocessingInk" xmlns:wne="http://schemas.microsoft.com/office/word/2006/wordml" xmlns:wps="http://schemas.microsoft.com/office/word/2010/wordprocessingShape" mc:Ignorable="w14 w15 w16se w16cid w16 w16cex w16sdtdh w16sdtfl w16du wp14">
+<w:hdr xmlns:wpc="http://schemas.microsoft.com/office/word/2010/wordprocessingCanvas" xmlns:cx="http://schemas.microsoft.com/office/drawing/2014/chartex" xmlns:cx1="http://schemas.microsoft.com/office/drawing/2015/9/8/chartex" xmlns:cx2="http://schemas.microsoft.com/office/drawing/2015/10/21/chartex" xmlns:cx3="http://schemas.microsoft.com/office/drawing/2016/5/9/chartex" xmlns:cx4="http://schemas.microsoft.com/office/drawing/2016/5/10/chartex" xmlns:cx5="http://schemas.microsoft.com/office/drawing/2016/5/11/chartex" xmlns:cx6="http://schemas.microsoft.com/office/drawing/2016/5/12/chartex" xmlns:cx7="http://schemas.microsoft.com/office/drawing/2016/5/13/chartex" xmlns:cx8="http://schemas.microsoft.com/office/drawing/2016/5/14/chartex" xmlns:mc="http://schemas.openxmlformats.org/markup-compatibility/2006" xmlns:aink="http://schemas.microsoft.com/office/drawing/2016/ink" xmlns:am3d="http://schemas.microsoft.com/office/drawing/2017/model3d" xmlns:o="urn:schemas-microsoft-com:office:office" xmlns:oel="http://schemas.microsoft.com/office/2019/extlst" xmlns:r="http://schemas.openxmlformats.org/officeDocument/2006/relationships" xmlns:m="http://schemas.openxmlformats.org/officeDocument/2006/math" xmlns:v="urn:schemas-microsoft-com:vml" xmlns:wp14="http://schemas.microsoft.com/office/word/2010/wordprocessingDrawing" xmlns:wp="http://schemas.openxmlformats.org/drawingml/2006/wordprocessingDrawing" xmlns:w10="urn:schemas-microsoft-com:office:word" xmlns:w="http://schemas.openxmlformats.org/wordprocessingml/2006/main" xmlns:w14="http://schemas.microsoft.com/office/word/2010/wordml" xmlns:w15="http://schemas.microsoft.com/office/word/2012/wordml" xmlns:w16cei="http://schemas.microsoft.com/office/word/2026/wordml/cei" xmlns:w16cex="http://schemas.microsoft.com/office/word/2018/wordml/cex" xmlns:w16cid="http://schemas.microsoft.com/office/word/2016/wordml/cid" xmlns:w16="http://schemas.microsoft.com/office/word/2018/wordml" xmlns:w16du="http://schemas.microsoft.com/office/word/2023/wordml/word16du" xmlns:w16sdtdh="http://schemas.microsoft.com/office/word/2020/wordml/sdtdatahash" xmlns:w16sdtfl="http://schemas.microsoft.com/office/word/2024/wordml/sdtformatlock" xmlns:w16se="http://schemas.microsoft.com/office/word/2015/wordml/symex" xmlns:wpg="http://schemas.microsoft.com/office/word/2010/wordprocessingGroup" xmlns:wpi="http://schemas.microsoft.com/office/word/2010/wordprocessingInk" xmlns:wne="http://schemas.microsoft.com/office/word/2006/wordml" xmlns:wps="http://schemas.microsoft.com/office/word/2010/wordprocessingShape" mc:Ignorable="w14 w15 w16se w16cid w16 w16cex w16sdtdh w16sdtfl w16du wp14">
   <w:p>
     <w:pPr>
       <w:pStyle w:val="En-tte"/>
@@ -16993,7 +16645,7 @@
 </file>
 
 <file path=word/numbering.xml><?xml version="1.0" encoding="utf-8"?>
-<w:numbering xmlns:wpc="http://schemas.microsoft.com/office/word/2010/wordprocessingCanvas" xmlns:cx="http://schemas.microsoft.com/office/drawing/2014/chartex" xmlns:cx1="http://schemas.microsoft.com/office/drawing/2015/9/8/chartex" xmlns:cx2="http://schemas.microsoft.com/office/drawing/2015/10/21/chartex" xmlns:cx3="http://schemas.microsoft.com/office/drawing/2016/5/9/chartex" xmlns:cx4="http://schemas.microsoft.com/office/drawing/2016/5/10/chartex" xmlns:cx5="http://schemas.microsoft.com/office/drawing/2016/5/11/chartex" xmlns:cx6="http://schemas.microsoft.com/office/drawing/2016/5/12/chartex" xmlns:cx7="http://schemas.microsoft.com/office/drawing/2016/5/13/chartex" xmlns:cx8="http://schemas.microsoft.com/office/drawing/2016/5/14/chartex" xmlns:mc="http://schemas.openxmlformats.org/markup-compatibility/2006" xmlns:aink="http://schemas.microsoft.com/office/drawing/2016/ink" xmlns:am3d="http://schemas.microsoft.com/office/drawing/2017/model3d" xmlns:o="urn:schemas-microsoft-com:office:office" xmlns:oel="http://schemas.microsoft.com/office/2019/extlst" xmlns:r="http://schemas.openxmlformats.org/officeDocument/2006/relationships" xmlns:m="http://schemas.openxmlformats.org/officeDocument/2006/math" xmlns:v="urn:schemas-microsoft-com:vml" xmlns:wp14="http://schemas.microsoft.com/office/word/2010/wordprocessingDrawing" xmlns:wp="http://schemas.openxmlformats.org/drawingml/2006/wordprocessingDrawing" xmlns:w10="urn:schemas-microsoft-com:office:word" xmlns:w="http://schemas.openxmlformats.org/wordprocessingml/2006/main" xmlns:w14="http://schemas.microsoft.com/office/word/2010/wordml" xmlns:w15="http://schemas.microsoft.com/office/word/2012/wordml" xmlns:w16cex="http://schemas.microsoft.com/office/word/2018/wordml/cex" xmlns:w16cid="http://schemas.microsoft.com/office/word/2016/wordml/cid" xmlns:w16="http://schemas.microsoft.com/office/word/2018/wordml" xmlns:w16du="http://schemas.microsoft.com/office/word/2023/wordml/word16du" xmlns:w16sdtdh="http://schemas.microsoft.com/office/word/2020/wordml/sdtdatahash" xmlns:w16sdtfl="http://schemas.microsoft.com/office/word/2024/wordml/sdtformatlock" xmlns:w16se="http://schemas.microsoft.com/office/word/2015/wordml/symex" xmlns:wpg="http://schemas.microsoft.com/office/word/2010/wordprocessingGroup" xmlns:wpi="http://schemas.microsoft.com/office/word/2010/wordprocessingInk" xmlns:wne="http://schemas.microsoft.com/office/word/2006/wordml" xmlns:wps="http://schemas.microsoft.com/office/word/2010/wordprocessingShape" mc:Ignorable="w14 w15 w16se w16cid w16 w16cex w16sdtdh w16sdtfl w16du wp14">
+<w:numbering xmlns:wpc="http://schemas.microsoft.com/office/word/2010/wordprocessingCanvas" xmlns:cx="http://schemas.microsoft.com/office/drawing/2014/chartex" xmlns:cx1="http://schemas.microsoft.com/office/drawing/2015/9/8/chartex" xmlns:cx2="http://schemas.microsoft.com/office/drawing/2015/10/21/chartex" xmlns:cx3="http://schemas.microsoft.com/office/drawing/2016/5/9/chartex" xmlns:cx4="http://schemas.microsoft.com/office/drawing/2016/5/10/chartex" xmlns:cx5="http://schemas.microsoft.com/office/drawing/2016/5/11/chartex" xmlns:cx6="http://schemas.microsoft.com/office/drawing/2016/5/12/chartex" xmlns:cx7="http://schemas.microsoft.com/office/drawing/2016/5/13/chartex" xmlns:cx8="http://schemas.microsoft.com/office/drawing/2016/5/14/chartex" xmlns:mc="http://schemas.openxmlformats.org/markup-compatibility/2006" xmlns:aink="http://schemas.microsoft.com/office/drawing/2016/ink" xmlns:am3d="http://schemas.microsoft.com/office/drawing/2017/model3d" xmlns:o="urn:schemas-microsoft-com:office:office" xmlns:oel="http://schemas.microsoft.com/office/2019/extlst" xmlns:r="http://schemas.openxmlformats.org/officeDocument/2006/relationships" xmlns:m="http://schemas.openxmlformats.org/officeDocument/2006/math" xmlns:v="urn:schemas-microsoft-com:vml" xmlns:wp14="http://schemas.microsoft.com/office/word/2010/wordprocessingDrawing" xmlns:wp="http://schemas.openxmlformats.org/drawingml/2006/wordprocessingDrawing" xmlns:w10="urn:schemas-microsoft-com:office:word" xmlns:w="http://schemas.openxmlformats.org/wordprocessingml/2006/main" xmlns:w14="http://schemas.microsoft.com/office/word/2010/wordml" xmlns:w15="http://schemas.microsoft.com/office/word/2012/wordml" xmlns:w16cei="http://schemas.microsoft.com/office/word/2026/wordml/cei" xmlns:w16cex="http://schemas.microsoft.com/office/word/2018/wordml/cex" xmlns:w16cid="http://schemas.microsoft.com/office/word/2016/wordml/cid" xmlns:w16="http://schemas.microsoft.com/office/word/2018/wordml" xmlns:w16du="http://schemas.microsoft.com/office/word/2023/wordml/word16du" xmlns:w16sdtdh="http://schemas.microsoft.com/office/word/2020/wordml/sdtdatahash" xmlns:w16sdtfl="http://schemas.microsoft.com/office/word/2024/wordml/sdtformatlock" xmlns:w16se="http://schemas.microsoft.com/office/word/2015/wordml/symex" xmlns:wpg="http://schemas.microsoft.com/office/word/2010/wordprocessingGroup" xmlns:wpi="http://schemas.microsoft.com/office/word/2010/wordprocessingInk" xmlns:wne="http://schemas.microsoft.com/office/word/2006/wordml" xmlns:wps="http://schemas.microsoft.com/office/word/2010/wordprocessingShape" mc:Ignorable="w14 w15 w16se w16cid w16 w16cex w16sdtdh w16sdtfl w16du wp14">
   <w:abstractNum w:abstractNumId="0" w15:restartNumberingAfterBreak="0">
     <w:nsid w:val="007B2E81"/>
     <w:multiLevelType w:val="multilevel"/>
@@ -22760,16 +22412,25 @@
 </file>
 
 <file path=customXml/item1.xml><?xml version="1.0" encoding="utf-8"?>
+<b:Sources xmlns:b="http://schemas.openxmlformats.org/officeDocument/2006/bibliography" xmlns="http://schemas.openxmlformats.org/officeDocument/2006/bibliography" SelectedStyle="\APASixthEditionOfficeOnline.xsl" StyleName="APA" Version="6"/>
+</file>
+
+<file path=customXml/item2.xml><?xml version="1.0" encoding="utf-8"?>
 <p:properties xmlns:p="http://schemas.microsoft.com/office/2006/metadata/properties" xmlns:xsi="http://www.w3.org/2001/XMLSchema-instance" xmlns:pc="http://schemas.microsoft.com/office/infopath/2007/PartnerControls">
   <documentManagement/>
 </p:properties>
 </file>
 
-<file path=customXml/item2.xml><?xml version="1.0" encoding="utf-8"?>
-<b:Sources xmlns:b="http://schemas.openxmlformats.org/officeDocument/2006/bibliography" xmlns="http://schemas.openxmlformats.org/officeDocument/2006/bibliography" SelectedStyle="\APASixthEditionOfficeOnline.xsl" StyleName="APA" Version="6"/>
+<file path=customXml/item3.xml><?xml version="1.0" encoding="utf-8"?>
+<?mso-contentType ?>
+<FormTemplates xmlns="http://schemas.microsoft.com/sharepoint/v3/contenttype/forms">
+  <Display>DocumentLibraryForm</Display>
+  <Edit>DocumentLibraryForm</Edit>
+  <New>DocumentLibraryForm</New>
+</FormTemplates>
 </file>
 
-<file path=customXml/item3.xml><?xml version="1.0" encoding="utf-8"?>
+<file path=customXml/item4.xml><?xml version="1.0" encoding="utf-8"?>
 <ct:contentTypeSchema xmlns:ct="http://schemas.microsoft.com/office/2006/metadata/contentType" xmlns:ma="http://schemas.microsoft.com/office/2006/metadata/properties/metaAttributes" ct:_="" ma:_="" ma:contentTypeName="Document" ma:contentTypeID="0x010100354AEAE9FD62D747A26A546E5B1B5735" ma:contentTypeVersion="7" ma:contentTypeDescription="Crée un document." ma:contentTypeScope="" ma:versionID="43b763fe9aa20b7a2976a5e019d82dbf">
   <xsd:schema xmlns:xsd="http://www.w3.org/2001/XMLSchema" xmlns:xs="http://www.w3.org/2001/XMLSchema" xmlns:p="http://schemas.microsoft.com/office/2006/metadata/properties" xmlns:ns2="071933db-0376-4694-9786-b56cb37c4ec2" targetNamespace="http://schemas.microsoft.com/office/2006/metadata/properties" ma:root="true" ma:fieldsID="d5c90ae6c1ec6ed317c9f5feddaf7a33" ns2:_="">
     <xsd:import namespace="071933db-0376-4694-9786-b56cb37c4ec2"/>
@@ -22933,16 +22594,15 @@
 </ct:contentTypeSchema>
 </file>
 
-<file path=customXml/item4.xml><?xml version="1.0" encoding="utf-8"?>
-<?mso-contentType ?>
-<FormTemplates xmlns="http://schemas.microsoft.com/sharepoint/v3/contenttype/forms">
-  <Display>DocumentLibraryForm</Display>
-  <Edit>DocumentLibraryForm</Edit>
-  <New>DocumentLibraryForm</New>
-</FormTemplates>
+<file path=customXml/itemProps1.xml><?xml version="1.0" encoding="utf-8"?>
+<ds:datastoreItem xmlns:ds="http://schemas.openxmlformats.org/officeDocument/2006/customXml" ds:itemID="{BA5DC8B6-1F73-4844-8DA8-B484D55D7FC3}">
+  <ds:schemaRefs>
+    <ds:schemaRef ds:uri="http://schemas.openxmlformats.org/officeDocument/2006/bibliography"/>
+  </ds:schemaRefs>
+</ds:datastoreItem>
 </file>
 
-<file path=customXml/itemProps1.xml><?xml version="1.0" encoding="utf-8"?>
+<file path=customXml/itemProps2.xml><?xml version="1.0" encoding="utf-8"?>
 <ds:datastoreItem xmlns:ds="http://schemas.openxmlformats.org/officeDocument/2006/customXml" ds:itemID="{2C36E056-BA2C-4A1F-9580-242C9B36FE70}">
   <ds:schemaRefs>
     <ds:schemaRef ds:uri="http://schemas.microsoft.com/office/2006/metadata/properties"/>
@@ -22951,15 +22611,15 @@
 </ds:datastoreItem>
 </file>
 
-<file path=customXml/itemProps2.xml><?xml version="1.0" encoding="utf-8"?>
-<ds:datastoreItem xmlns:ds="http://schemas.openxmlformats.org/officeDocument/2006/customXml" ds:itemID="{BA5DC8B6-1F73-4844-8DA8-B484D55D7FC3}">
+<file path=customXml/itemProps3.xml><?xml version="1.0" encoding="utf-8"?>
+<ds:datastoreItem xmlns:ds="http://schemas.openxmlformats.org/officeDocument/2006/customXml" ds:itemID="{F6194C16-5FE5-4670-BEC8-3D6DD9380312}">
   <ds:schemaRefs>
-    <ds:schemaRef ds:uri="http://schemas.openxmlformats.org/officeDocument/2006/bibliography"/>
+    <ds:schemaRef ds:uri="http://schemas.microsoft.com/sharepoint/v3/contenttype/forms"/>
   </ds:schemaRefs>
 </ds:datastoreItem>
 </file>
 
-<file path=customXml/itemProps3.xml><?xml version="1.0" encoding="utf-8"?>
+<file path=customXml/itemProps4.xml><?xml version="1.0" encoding="utf-8"?>
 <ds:datastoreItem xmlns:ds="http://schemas.openxmlformats.org/officeDocument/2006/customXml" ds:itemID="{5C3A06EC-DC03-4D65-AA15-C6B9D68C1ED0}">
   <ds:schemaRefs>
     <ds:schemaRef ds:uri="http://schemas.microsoft.com/office/2006/metadata/contentType"/>
@@ -22975,12 +22635,4 @@
     <ds:schemaRef ds:uri="http://schemas.microsoft.com/internal/obd"/>
   </ds:schemaRefs>
 </ds:datastoreItem>
-</file>
-
-<file path=customXml/itemProps4.xml><?xml version="1.0" encoding="utf-8"?>
-<ds:datastoreItem xmlns:ds="http://schemas.openxmlformats.org/officeDocument/2006/customXml" ds:itemID="{F6194C16-5FE5-4670-BEC8-3D6DD9380312}">
-  <ds:schemaRefs>
-    <ds:schemaRef ds:uri="http://schemas.microsoft.com/sharepoint/v3/contenttype/forms"/>
-  </ds:schemaRefs>
-</ds:datastoreItem>
 </file>
</xml_diff>

<commit_message>
PAS IMPORTANT modification du document Word
Des annotations ont étés effacées
</commit_message>
<xml_diff>
--- a/S01_Lab2_Instructions.docx
+++ b/S01_Lab2_Instructions.docx
@@ -1,6 +1,6 @@
 
 <file path=word/document.xml><?xml version="1.0" encoding="utf-8"?>
-<w:document xmlns:wpc="http://schemas.microsoft.com/office/word/2010/wordprocessingCanvas" xmlns:cx="http://schemas.microsoft.com/office/drawing/2014/chartex" xmlns:cx1="http://schemas.microsoft.com/office/drawing/2015/9/8/chartex" xmlns:cx2="http://schemas.microsoft.com/office/drawing/2015/10/21/chartex" xmlns:cx3="http://schemas.microsoft.com/office/drawing/2016/5/9/chartex" xmlns:cx4="http://schemas.microsoft.com/office/drawing/2016/5/10/chartex" xmlns:cx5="http://schemas.microsoft.com/office/drawing/2016/5/11/chartex" xmlns:cx6="http://schemas.microsoft.com/office/drawing/2016/5/12/chartex" xmlns:cx7="http://schemas.microsoft.com/office/drawing/2016/5/13/chartex" xmlns:cx8="http://schemas.microsoft.com/office/drawing/2016/5/14/chartex" xmlns:mc="http://schemas.openxmlformats.org/markup-compatibility/2006" xmlns:aink="http://schemas.microsoft.com/office/drawing/2016/ink" xmlns:am3d="http://schemas.microsoft.com/office/drawing/2017/model3d" xmlns:o="urn:schemas-microsoft-com:office:office" xmlns:oel="http://schemas.microsoft.com/office/2019/extlst" xmlns:r="http://schemas.openxmlformats.org/officeDocument/2006/relationships" xmlns:m="http://schemas.openxmlformats.org/officeDocument/2006/math" xmlns:v="urn:schemas-microsoft-com:vml" xmlns:wp14="http://schemas.microsoft.com/office/word/2010/wordprocessingDrawing" xmlns:wp="http://schemas.openxmlformats.org/drawingml/2006/wordprocessingDrawing" xmlns:w10="urn:schemas-microsoft-com:office:word" xmlns:w="http://schemas.openxmlformats.org/wordprocessingml/2006/main" xmlns:w14="http://schemas.microsoft.com/office/word/2010/wordml" xmlns:w15="http://schemas.microsoft.com/office/word/2012/wordml" xmlns:w16cex="http://schemas.microsoft.com/office/word/2018/wordml/cex" xmlns:w16cid="http://schemas.microsoft.com/office/word/2016/wordml/cid" xmlns:w16="http://schemas.microsoft.com/office/word/2018/wordml" xmlns:w16du="http://schemas.microsoft.com/office/word/2023/wordml/word16du" xmlns:w16sdtdh="http://schemas.microsoft.com/office/word/2020/wordml/sdtdatahash" xmlns:w16sdtfl="http://schemas.microsoft.com/office/word/2024/wordml/sdtformatlock" xmlns:w16se="http://schemas.microsoft.com/office/word/2015/wordml/symex" xmlns:wpg="http://schemas.microsoft.com/office/word/2010/wordprocessingGroup" xmlns:wpi="http://schemas.microsoft.com/office/word/2010/wordprocessingInk" xmlns:wne="http://schemas.microsoft.com/office/word/2006/wordml" xmlns:wps="http://schemas.microsoft.com/office/word/2010/wordprocessingShape" mc:Ignorable="w14 w15 w16se w16cid w16 w16cex w16sdtdh w16sdtfl w16du wp14">
+<w:document xmlns:wpc="http://schemas.microsoft.com/office/word/2010/wordprocessingCanvas" xmlns:cx="http://schemas.microsoft.com/office/drawing/2014/chartex" xmlns:cx1="http://schemas.microsoft.com/office/drawing/2015/9/8/chartex" xmlns:cx2="http://schemas.microsoft.com/office/drawing/2015/10/21/chartex" xmlns:cx3="http://schemas.microsoft.com/office/drawing/2016/5/9/chartex" xmlns:cx4="http://schemas.microsoft.com/office/drawing/2016/5/10/chartex" xmlns:cx5="http://schemas.microsoft.com/office/drawing/2016/5/11/chartex" xmlns:cx6="http://schemas.microsoft.com/office/drawing/2016/5/12/chartex" xmlns:cx7="http://schemas.microsoft.com/office/drawing/2016/5/13/chartex" xmlns:cx8="http://schemas.microsoft.com/office/drawing/2016/5/14/chartex" xmlns:mc="http://schemas.openxmlformats.org/markup-compatibility/2006" xmlns:aink="http://schemas.microsoft.com/office/drawing/2016/ink" xmlns:am3d="http://schemas.microsoft.com/office/drawing/2017/model3d" xmlns:o="urn:schemas-microsoft-com:office:office" xmlns:oel="http://schemas.microsoft.com/office/2019/extlst" xmlns:r="http://schemas.openxmlformats.org/officeDocument/2006/relationships" xmlns:m="http://schemas.openxmlformats.org/officeDocument/2006/math" xmlns:v="urn:schemas-microsoft-com:vml" xmlns:wp14="http://schemas.microsoft.com/office/word/2010/wordprocessingDrawing" xmlns:wp="http://schemas.openxmlformats.org/drawingml/2006/wordprocessingDrawing" xmlns:w10="urn:schemas-microsoft-com:office:word" xmlns:w="http://schemas.openxmlformats.org/wordprocessingml/2006/main" xmlns:w14="http://schemas.microsoft.com/office/word/2010/wordml" xmlns:w15="http://schemas.microsoft.com/office/word/2012/wordml" xmlns:w16cei="http://schemas.microsoft.com/office/word/2026/wordml/cei" xmlns:w16cex="http://schemas.microsoft.com/office/word/2018/wordml/cex" xmlns:w16cid="http://schemas.microsoft.com/office/word/2016/wordml/cid" xmlns:w16="http://schemas.microsoft.com/office/word/2018/wordml" xmlns:w16du="http://schemas.microsoft.com/office/word/2023/wordml/word16du" xmlns:w16sdtdh="http://schemas.microsoft.com/office/word/2020/wordml/sdtdatahash" xmlns:w16sdtfl="http://schemas.microsoft.com/office/word/2024/wordml/sdtformatlock" xmlns:w16se="http://schemas.microsoft.com/office/word/2015/wordml/symex" xmlns:wpg="http://schemas.microsoft.com/office/word/2010/wordprocessingGroup" xmlns:wpi="http://schemas.microsoft.com/office/word/2010/wordprocessingInk" xmlns:wne="http://schemas.microsoft.com/office/word/2006/wordml" xmlns:wps="http://schemas.microsoft.com/office/word/2010/wordprocessingShape" mc:Ignorable="w14 w15 w16se w16cid w16 w16cex w16sdtdh w16sdtfl w16du wp14">
   <w:background w:color="EBF9FF"/>
   <w:body>
     <w:p>
@@ -667,7 +667,23 @@
           <w:b/>
           <w:bCs/>
         </w:rPr>
-        <w:t xml:space="preserve"> Net Core </w:t>
+        <w:t xml:space="preserve"> Net </w:t>
+      </w:r>
+      <w:proofErr w:type="spellStart"/>
+      <w:r>
+        <w:rPr>
+          <w:b/>
+          <w:bCs/>
+        </w:rPr>
+        <w:t>Core</w:t>
+      </w:r>
+      <w:proofErr w:type="spellEnd"/>
+      <w:r>
+        <w:rPr>
+          <w:b/>
+          <w:bCs/>
+        </w:rPr>
+        <w:t xml:space="preserve"> </w:t>
       </w:r>
       <w:r>
         <w:rPr>
@@ -2375,7 +2391,7 @@
           <w:noProof/>
         </w:rPr>
         <w:drawing>
-          <wp:inline distT="0" distB="0" distL="0" distR="0" wp14:anchorId="2A3568C3" wp14:editId="6FC782A7">
+          <wp:inline distT="0" distB="0" distL="0" distR="0" wp14:anchorId="2A3568C3" wp14:editId="72B0B281">
             <wp:extent cx="1722213" cy="644379"/>
             <wp:effectExtent l="0" t="0" r="0" b="3810"/>
             <wp:docPr id="8" name="Image 8"/>
@@ -5199,29 +5215,7 @@
           <w:szCs w:val="19"/>
           <w:highlight w:val="green"/>
         </w:rPr>
-        <w:t>"</w:t>
-      </w:r>
-      <w:proofErr w:type="spellStart"/>
-      <w:r>
-        <w:rPr>
-          <w:rFonts w:ascii="Consolas" w:hAnsi="Consolas" w:cs="Consolas"/>
-          <w:color w:val="A31515"/>
-          <w:sz w:val="19"/>
-          <w:szCs w:val="19"/>
-          <w:highlight w:val="green"/>
-        </w:rPr>
-        <w:t>Draugr</w:t>
-      </w:r>
-      <w:proofErr w:type="spellEnd"/>
-      <w:r>
-        <w:rPr>
-          <w:rFonts w:ascii="Consolas" w:hAnsi="Consolas" w:cs="Consolas"/>
-          <w:color w:val="A31515"/>
-          <w:sz w:val="19"/>
-          <w:szCs w:val="19"/>
-          <w:highlight w:val="green"/>
-        </w:rPr>
-        <w:t>"</w:t>
+        <w:t>"Draugr"</w:t>
       </w:r>
       <w:r>
         <w:rPr>
@@ -13135,7 +13129,15 @@
       </w:r>
       <w:proofErr w:type="gramEnd"/>
       <w:r>
-        <w:t>)), View Razor vide</w:t>
+        <w:t xml:space="preserve">)), </w:t>
+      </w:r>
+      <w:proofErr w:type="spellStart"/>
+      <w:r>
+        <w:t>View</w:t>
+      </w:r>
+      <w:proofErr w:type="spellEnd"/>
+      <w:r>
+        <w:t xml:space="preserve"> Razor vide</w:t>
       </w:r>
     </w:p>
     <w:p>
@@ -15528,8 +15530,6 @@
       <w:r>
         <w:rPr>
           <w:rFonts w:ascii="Cascadia Mono" w:hAnsi="Cascadia Mono" w:cs="Cascadia Mono"/>
-          <w:b/>
-          <w:bCs/>
           <w:color w:val="800080"/>
           <w:sz w:val="19"/>
           <w:szCs w:val="19"/>
@@ -15550,8 +15550,6 @@
       <w:r>
         <w:rPr>
           <w:rFonts w:ascii="Cascadia Mono" w:hAnsi="Cascadia Mono" w:cs="Cascadia Mono"/>
-          <w:b/>
-          <w:bCs/>
           <w:color w:val="800080"/>
           <w:sz w:val="19"/>
           <w:szCs w:val="19"/>
@@ -16861,7 +16859,7 @@
 </file>
 
 <file path=word/endnotes.xml><?xml version="1.0" encoding="utf-8"?>
-<w:endnotes xmlns:wpc="http://schemas.microsoft.com/office/word/2010/wordprocessingCanvas" xmlns:cx="http://schemas.microsoft.com/office/drawing/2014/chartex" xmlns:cx1="http://schemas.microsoft.com/office/drawing/2015/9/8/chartex" xmlns:cx2="http://schemas.microsoft.com/office/drawing/2015/10/21/chartex" xmlns:cx3="http://schemas.microsoft.com/office/drawing/2016/5/9/chartex" xmlns:cx4="http://schemas.microsoft.com/office/drawing/2016/5/10/chartex" xmlns:cx5="http://schemas.microsoft.com/office/drawing/2016/5/11/chartex" xmlns:cx6="http://schemas.microsoft.com/office/drawing/2016/5/12/chartex" xmlns:cx7="http://schemas.microsoft.com/office/drawing/2016/5/13/chartex" xmlns:cx8="http://schemas.microsoft.com/office/drawing/2016/5/14/chartex" xmlns:mc="http://schemas.openxmlformats.org/markup-compatibility/2006" xmlns:aink="http://schemas.microsoft.com/office/drawing/2016/ink" xmlns:am3d="http://schemas.microsoft.com/office/drawing/2017/model3d" xmlns:o="urn:schemas-microsoft-com:office:office" xmlns:oel="http://schemas.microsoft.com/office/2019/extlst" xmlns:r="http://schemas.openxmlformats.org/officeDocument/2006/relationships" xmlns:m="http://schemas.openxmlformats.org/officeDocument/2006/math" xmlns:v="urn:schemas-microsoft-com:vml" xmlns:wp14="http://schemas.microsoft.com/office/word/2010/wordprocessingDrawing" xmlns:wp="http://schemas.openxmlformats.org/drawingml/2006/wordprocessingDrawing" xmlns:w10="urn:schemas-microsoft-com:office:word" xmlns:w="http://schemas.openxmlformats.org/wordprocessingml/2006/main" xmlns:w14="http://schemas.microsoft.com/office/word/2010/wordml" xmlns:w15="http://schemas.microsoft.com/office/word/2012/wordml" xmlns:w16cex="http://schemas.microsoft.com/office/word/2018/wordml/cex" xmlns:w16cid="http://schemas.microsoft.com/office/word/2016/wordml/cid" xmlns:w16="http://schemas.microsoft.com/office/word/2018/wordml" xmlns:w16du="http://schemas.microsoft.com/office/word/2023/wordml/word16du" xmlns:w16sdtdh="http://schemas.microsoft.com/office/word/2020/wordml/sdtdatahash" xmlns:w16sdtfl="http://schemas.microsoft.com/office/word/2024/wordml/sdtformatlock" xmlns:w16se="http://schemas.microsoft.com/office/word/2015/wordml/symex" xmlns:wpg="http://schemas.microsoft.com/office/word/2010/wordprocessingGroup" xmlns:wpi="http://schemas.microsoft.com/office/word/2010/wordprocessingInk" xmlns:wne="http://schemas.microsoft.com/office/word/2006/wordml" xmlns:wps="http://schemas.microsoft.com/office/word/2010/wordprocessingShape" mc:Ignorable="w14 w15 w16se w16cid w16 w16cex w16sdtdh w16sdtfl w16du wp14">
+<w:endnotes xmlns:wpc="http://schemas.microsoft.com/office/word/2010/wordprocessingCanvas" xmlns:cx="http://schemas.microsoft.com/office/drawing/2014/chartex" xmlns:cx1="http://schemas.microsoft.com/office/drawing/2015/9/8/chartex" xmlns:cx2="http://schemas.microsoft.com/office/drawing/2015/10/21/chartex" xmlns:cx3="http://schemas.microsoft.com/office/drawing/2016/5/9/chartex" xmlns:cx4="http://schemas.microsoft.com/office/drawing/2016/5/10/chartex" xmlns:cx5="http://schemas.microsoft.com/office/drawing/2016/5/11/chartex" xmlns:cx6="http://schemas.microsoft.com/office/drawing/2016/5/12/chartex" xmlns:cx7="http://schemas.microsoft.com/office/drawing/2016/5/13/chartex" xmlns:cx8="http://schemas.microsoft.com/office/drawing/2016/5/14/chartex" xmlns:mc="http://schemas.openxmlformats.org/markup-compatibility/2006" xmlns:aink="http://schemas.microsoft.com/office/drawing/2016/ink" xmlns:am3d="http://schemas.microsoft.com/office/drawing/2017/model3d" xmlns:o="urn:schemas-microsoft-com:office:office" xmlns:oel="http://schemas.microsoft.com/office/2019/extlst" xmlns:r="http://schemas.openxmlformats.org/officeDocument/2006/relationships" xmlns:m="http://schemas.openxmlformats.org/officeDocument/2006/math" xmlns:v="urn:schemas-microsoft-com:vml" xmlns:wp14="http://schemas.microsoft.com/office/word/2010/wordprocessingDrawing" xmlns:wp="http://schemas.openxmlformats.org/drawingml/2006/wordprocessingDrawing" xmlns:w10="urn:schemas-microsoft-com:office:word" xmlns:w="http://schemas.openxmlformats.org/wordprocessingml/2006/main" xmlns:w14="http://schemas.microsoft.com/office/word/2010/wordml" xmlns:w15="http://schemas.microsoft.com/office/word/2012/wordml" xmlns:w16cei="http://schemas.microsoft.com/office/word/2026/wordml/cei" xmlns:w16cex="http://schemas.microsoft.com/office/word/2018/wordml/cex" xmlns:w16cid="http://schemas.microsoft.com/office/word/2016/wordml/cid" xmlns:w16="http://schemas.microsoft.com/office/word/2018/wordml" xmlns:w16du="http://schemas.microsoft.com/office/word/2023/wordml/word16du" xmlns:w16sdtdh="http://schemas.microsoft.com/office/word/2020/wordml/sdtdatahash" xmlns:w16sdtfl="http://schemas.microsoft.com/office/word/2024/wordml/sdtformatlock" xmlns:w16se="http://schemas.microsoft.com/office/word/2015/wordml/symex" xmlns:wpg="http://schemas.microsoft.com/office/word/2010/wordprocessingGroup" xmlns:wpi="http://schemas.microsoft.com/office/word/2010/wordprocessingInk" xmlns:wne="http://schemas.microsoft.com/office/word/2006/wordml" xmlns:wps="http://schemas.microsoft.com/office/word/2010/wordprocessingShape" mc:Ignorable="w14 w15 w16se w16cid w16 w16cex w16sdtdh w16sdtfl w16du wp14">
   <w:endnote w:type="separator" w:id="-1">
     <w:p>
       <w:r>
@@ -16880,7 +16878,7 @@
 </file>
 
 <file path=word/footer1.xml><?xml version="1.0" encoding="utf-8"?>
-<w:ftr xmlns:wpc="http://schemas.microsoft.com/office/word/2010/wordprocessingCanvas" xmlns:cx="http://schemas.microsoft.com/office/drawing/2014/chartex" xmlns:cx1="http://schemas.microsoft.com/office/drawing/2015/9/8/chartex" xmlns:cx2="http://schemas.microsoft.com/office/drawing/2015/10/21/chartex" xmlns:cx3="http://schemas.microsoft.com/office/drawing/2016/5/9/chartex" xmlns:cx4="http://schemas.microsoft.com/office/drawing/2016/5/10/chartex" xmlns:cx5="http://schemas.microsoft.com/office/drawing/2016/5/11/chartex" xmlns:cx6="http://schemas.microsoft.com/office/drawing/2016/5/12/chartex" xmlns:cx7="http://schemas.microsoft.com/office/drawing/2016/5/13/chartex" xmlns:cx8="http://schemas.microsoft.com/office/drawing/2016/5/14/chartex" xmlns:mc="http://schemas.openxmlformats.org/markup-compatibility/2006" xmlns:aink="http://schemas.microsoft.com/office/drawing/2016/ink" xmlns:am3d="http://schemas.microsoft.com/office/drawing/2017/model3d" xmlns:o="urn:schemas-microsoft-com:office:office" xmlns:oel="http://schemas.microsoft.com/office/2019/extlst" xmlns:r="http://schemas.openxmlformats.org/officeDocument/2006/relationships" xmlns:m="http://schemas.openxmlformats.org/officeDocument/2006/math" xmlns:v="urn:schemas-microsoft-com:vml" xmlns:wp14="http://schemas.microsoft.com/office/word/2010/wordprocessingDrawing" xmlns:wp="http://schemas.openxmlformats.org/drawingml/2006/wordprocessingDrawing" xmlns:w10="urn:schemas-microsoft-com:office:word" xmlns:w="http://schemas.openxmlformats.org/wordprocessingml/2006/main" xmlns:w14="http://schemas.microsoft.com/office/word/2010/wordml" xmlns:w15="http://schemas.microsoft.com/office/word/2012/wordml" xmlns:w16cex="http://schemas.microsoft.com/office/word/2018/wordml/cex" xmlns:w16cid="http://schemas.microsoft.com/office/word/2016/wordml/cid" xmlns:w16="http://schemas.microsoft.com/office/word/2018/wordml" xmlns:w16du="http://schemas.microsoft.com/office/word/2023/wordml/word16du" xmlns:w16sdtdh="http://schemas.microsoft.com/office/word/2020/wordml/sdtdatahash" xmlns:w16sdtfl="http://schemas.microsoft.com/office/word/2024/wordml/sdtformatlock" xmlns:w16se="http://schemas.microsoft.com/office/word/2015/wordml/symex" xmlns:wpg="http://schemas.microsoft.com/office/word/2010/wordprocessingGroup" xmlns:wpi="http://schemas.microsoft.com/office/word/2010/wordprocessingInk" xmlns:wne="http://schemas.microsoft.com/office/word/2006/wordml" xmlns:wps="http://schemas.microsoft.com/office/word/2010/wordprocessingShape" mc:Ignorable="w14 w15 w16se w16cid w16 w16cex w16sdtdh w16sdtfl w16du wp14">
+<w:ftr xmlns:wpc="http://schemas.microsoft.com/office/word/2010/wordprocessingCanvas" xmlns:cx="http://schemas.microsoft.com/office/drawing/2014/chartex" xmlns:cx1="http://schemas.microsoft.com/office/drawing/2015/9/8/chartex" xmlns:cx2="http://schemas.microsoft.com/office/drawing/2015/10/21/chartex" xmlns:cx3="http://schemas.microsoft.com/office/drawing/2016/5/9/chartex" xmlns:cx4="http://schemas.microsoft.com/office/drawing/2016/5/10/chartex" xmlns:cx5="http://schemas.microsoft.com/office/drawing/2016/5/11/chartex" xmlns:cx6="http://schemas.microsoft.com/office/drawing/2016/5/12/chartex" xmlns:cx7="http://schemas.microsoft.com/office/drawing/2016/5/13/chartex" xmlns:cx8="http://schemas.microsoft.com/office/drawing/2016/5/14/chartex" xmlns:mc="http://schemas.openxmlformats.org/markup-compatibility/2006" xmlns:aink="http://schemas.microsoft.com/office/drawing/2016/ink" xmlns:am3d="http://schemas.microsoft.com/office/drawing/2017/model3d" xmlns:o="urn:schemas-microsoft-com:office:office" xmlns:oel="http://schemas.microsoft.com/office/2019/extlst" xmlns:r="http://schemas.openxmlformats.org/officeDocument/2006/relationships" xmlns:m="http://schemas.openxmlformats.org/officeDocument/2006/math" xmlns:v="urn:schemas-microsoft-com:vml" xmlns:wp14="http://schemas.microsoft.com/office/word/2010/wordprocessingDrawing" xmlns:wp="http://schemas.openxmlformats.org/drawingml/2006/wordprocessingDrawing" xmlns:w10="urn:schemas-microsoft-com:office:word" xmlns:w="http://schemas.openxmlformats.org/wordprocessingml/2006/main" xmlns:w14="http://schemas.microsoft.com/office/word/2010/wordml" xmlns:w15="http://schemas.microsoft.com/office/word/2012/wordml" xmlns:w16cei="http://schemas.microsoft.com/office/word/2026/wordml/cei" xmlns:w16cex="http://schemas.microsoft.com/office/word/2018/wordml/cex" xmlns:w16cid="http://schemas.microsoft.com/office/word/2016/wordml/cid" xmlns:w16="http://schemas.microsoft.com/office/word/2018/wordml" xmlns:w16du="http://schemas.microsoft.com/office/word/2023/wordml/word16du" xmlns:w16sdtdh="http://schemas.microsoft.com/office/word/2020/wordml/sdtdatahash" xmlns:w16sdtfl="http://schemas.microsoft.com/office/word/2024/wordml/sdtformatlock" xmlns:w16se="http://schemas.microsoft.com/office/word/2015/wordml/symex" xmlns:wpg="http://schemas.microsoft.com/office/word/2010/wordprocessingGroup" xmlns:wpi="http://schemas.microsoft.com/office/word/2010/wordprocessingInk" xmlns:wne="http://schemas.microsoft.com/office/word/2006/wordml" xmlns:wps="http://schemas.microsoft.com/office/word/2010/wordprocessingShape" mc:Ignorable="w14 w15 w16se w16cid w16 w16cex w16sdtdh w16sdtfl w16du wp14">
   <w:p>
     <w:pPr>
       <w:pStyle w:val="Pieddepage"/>
@@ -16933,7 +16931,7 @@
 </file>
 
 <file path=word/footnotes.xml><?xml version="1.0" encoding="utf-8"?>
-<w:footnotes xmlns:wpc="http://schemas.microsoft.com/office/word/2010/wordprocessingCanvas" xmlns:cx="http://schemas.microsoft.com/office/drawing/2014/chartex" xmlns:cx1="http://schemas.microsoft.com/office/drawing/2015/9/8/chartex" xmlns:cx2="http://schemas.microsoft.com/office/drawing/2015/10/21/chartex" xmlns:cx3="http://schemas.microsoft.com/office/drawing/2016/5/9/chartex" xmlns:cx4="http://schemas.microsoft.com/office/drawing/2016/5/10/chartex" xmlns:cx5="http://schemas.microsoft.com/office/drawing/2016/5/11/chartex" xmlns:cx6="http://schemas.microsoft.com/office/drawing/2016/5/12/chartex" xmlns:cx7="http://schemas.microsoft.com/office/drawing/2016/5/13/chartex" xmlns:cx8="http://schemas.microsoft.com/office/drawing/2016/5/14/chartex" xmlns:mc="http://schemas.openxmlformats.org/markup-compatibility/2006" xmlns:aink="http://schemas.microsoft.com/office/drawing/2016/ink" xmlns:am3d="http://schemas.microsoft.com/office/drawing/2017/model3d" xmlns:o="urn:schemas-microsoft-com:office:office" xmlns:oel="http://schemas.microsoft.com/office/2019/extlst" xmlns:r="http://schemas.openxmlformats.org/officeDocument/2006/relationships" xmlns:m="http://schemas.openxmlformats.org/officeDocument/2006/math" xmlns:v="urn:schemas-microsoft-com:vml" xmlns:wp14="http://schemas.microsoft.com/office/word/2010/wordprocessingDrawing" xmlns:wp="http://schemas.openxmlformats.org/drawingml/2006/wordprocessingDrawing" xmlns:w10="urn:schemas-microsoft-com:office:word" xmlns:w="http://schemas.openxmlformats.org/wordprocessingml/2006/main" xmlns:w14="http://schemas.microsoft.com/office/word/2010/wordml" xmlns:w15="http://schemas.microsoft.com/office/word/2012/wordml" xmlns:w16cex="http://schemas.microsoft.com/office/word/2018/wordml/cex" xmlns:w16cid="http://schemas.microsoft.com/office/word/2016/wordml/cid" xmlns:w16="http://schemas.microsoft.com/office/word/2018/wordml" xmlns:w16du="http://schemas.microsoft.com/office/word/2023/wordml/word16du" xmlns:w16sdtdh="http://schemas.microsoft.com/office/word/2020/wordml/sdtdatahash" xmlns:w16sdtfl="http://schemas.microsoft.com/office/word/2024/wordml/sdtformatlock" xmlns:w16se="http://schemas.microsoft.com/office/word/2015/wordml/symex" xmlns:wpg="http://schemas.microsoft.com/office/word/2010/wordprocessingGroup" xmlns:wpi="http://schemas.microsoft.com/office/word/2010/wordprocessingInk" xmlns:wne="http://schemas.microsoft.com/office/word/2006/wordml" xmlns:wps="http://schemas.microsoft.com/office/word/2010/wordprocessingShape" mc:Ignorable="w14 w15 w16se w16cid w16 w16cex w16sdtdh w16sdtfl w16du wp14">
+<w:footnotes xmlns:wpc="http://schemas.microsoft.com/office/word/2010/wordprocessingCanvas" xmlns:cx="http://schemas.microsoft.com/office/drawing/2014/chartex" xmlns:cx1="http://schemas.microsoft.com/office/drawing/2015/9/8/chartex" xmlns:cx2="http://schemas.microsoft.com/office/drawing/2015/10/21/chartex" xmlns:cx3="http://schemas.microsoft.com/office/drawing/2016/5/9/chartex" xmlns:cx4="http://schemas.microsoft.com/office/drawing/2016/5/10/chartex" xmlns:cx5="http://schemas.microsoft.com/office/drawing/2016/5/11/chartex" xmlns:cx6="http://schemas.microsoft.com/office/drawing/2016/5/12/chartex" xmlns:cx7="http://schemas.microsoft.com/office/drawing/2016/5/13/chartex" xmlns:cx8="http://schemas.microsoft.com/office/drawing/2016/5/14/chartex" xmlns:mc="http://schemas.openxmlformats.org/markup-compatibility/2006" xmlns:aink="http://schemas.microsoft.com/office/drawing/2016/ink" xmlns:am3d="http://schemas.microsoft.com/office/drawing/2017/model3d" xmlns:o="urn:schemas-microsoft-com:office:office" xmlns:oel="http://schemas.microsoft.com/office/2019/extlst" xmlns:r="http://schemas.openxmlformats.org/officeDocument/2006/relationships" xmlns:m="http://schemas.openxmlformats.org/officeDocument/2006/math" xmlns:v="urn:schemas-microsoft-com:vml" xmlns:wp14="http://schemas.microsoft.com/office/word/2010/wordprocessingDrawing" xmlns:wp="http://schemas.openxmlformats.org/drawingml/2006/wordprocessingDrawing" xmlns:w10="urn:schemas-microsoft-com:office:word" xmlns:w="http://schemas.openxmlformats.org/wordprocessingml/2006/main" xmlns:w14="http://schemas.microsoft.com/office/word/2010/wordml" xmlns:w15="http://schemas.microsoft.com/office/word/2012/wordml" xmlns:w16cei="http://schemas.microsoft.com/office/word/2026/wordml/cei" xmlns:w16cex="http://schemas.microsoft.com/office/word/2018/wordml/cex" xmlns:w16cid="http://schemas.microsoft.com/office/word/2016/wordml/cid" xmlns:w16="http://schemas.microsoft.com/office/word/2018/wordml" xmlns:w16du="http://schemas.microsoft.com/office/word/2023/wordml/word16du" xmlns:w16sdtdh="http://schemas.microsoft.com/office/word/2020/wordml/sdtdatahash" xmlns:w16sdtfl="http://schemas.microsoft.com/office/word/2024/wordml/sdtformatlock" xmlns:w16se="http://schemas.microsoft.com/office/word/2015/wordml/symex" xmlns:wpg="http://schemas.microsoft.com/office/word/2010/wordprocessingGroup" xmlns:wpi="http://schemas.microsoft.com/office/word/2010/wordprocessingInk" xmlns:wne="http://schemas.microsoft.com/office/word/2006/wordml" xmlns:wps="http://schemas.microsoft.com/office/word/2010/wordprocessingShape" mc:Ignorable="w14 w15 w16se w16cid w16 w16cex w16sdtdh w16sdtfl w16du wp14">
   <w:footnote w:type="separator" w:id="-1">
     <w:p>
       <w:r>
@@ -16952,7 +16950,7 @@
 </file>
 
 <file path=word/header1.xml><?xml version="1.0" encoding="utf-8"?>
-<w:hdr xmlns:wpc="http://schemas.microsoft.com/office/word/2010/wordprocessingCanvas" xmlns:cx="http://schemas.microsoft.com/office/drawing/2014/chartex" xmlns:cx1="http://schemas.microsoft.com/office/drawing/2015/9/8/chartex" xmlns:cx2="http://schemas.microsoft.com/office/drawing/2015/10/21/chartex" xmlns:cx3="http://schemas.microsoft.com/office/drawing/2016/5/9/chartex" xmlns:cx4="http://schemas.microsoft.com/office/drawing/2016/5/10/chartex" xmlns:cx5="http://schemas.microsoft.com/office/drawing/2016/5/11/chartex" xmlns:cx6="http://schemas.microsoft.com/office/drawing/2016/5/12/chartex" xmlns:cx7="http://schemas.microsoft.com/office/drawing/2016/5/13/chartex" xmlns:cx8="http://schemas.microsoft.com/office/drawing/2016/5/14/chartex" xmlns:mc="http://schemas.openxmlformats.org/markup-compatibility/2006" xmlns:aink="http://schemas.microsoft.com/office/drawing/2016/ink" xmlns:am3d="http://schemas.microsoft.com/office/drawing/2017/model3d" xmlns:o="urn:schemas-microsoft-com:office:office" xmlns:oel="http://schemas.microsoft.com/office/2019/extlst" xmlns:r="http://schemas.openxmlformats.org/officeDocument/2006/relationships" xmlns:m="http://schemas.openxmlformats.org/officeDocument/2006/math" xmlns:v="urn:schemas-microsoft-com:vml" xmlns:wp14="http://schemas.microsoft.com/office/word/2010/wordprocessingDrawing" xmlns:wp="http://schemas.openxmlformats.org/drawingml/2006/wordprocessingDrawing" xmlns:w10="urn:schemas-microsoft-com:office:word" xmlns:w="http://schemas.openxmlformats.org/wordprocessingml/2006/main" xmlns:w14="http://schemas.microsoft.com/office/word/2010/wordml" xmlns:w15="http://schemas.microsoft.com/office/word/2012/wordml" xmlns:w16cex="http://schemas.microsoft.com/office/word/2018/wordml/cex" xmlns:w16cid="http://schemas.microsoft.com/office/word/2016/wordml/cid" xmlns:w16="http://schemas.microsoft.com/office/word/2018/wordml" xmlns:w16du="http://schemas.microsoft.com/office/word/2023/wordml/word16du" xmlns:w16sdtdh="http://schemas.microsoft.com/office/word/2020/wordml/sdtdatahash" xmlns:w16sdtfl="http://schemas.microsoft.com/office/word/2024/wordml/sdtformatlock" xmlns:w16se="http://schemas.microsoft.com/office/word/2015/wordml/symex" xmlns:wpg="http://schemas.microsoft.com/office/word/2010/wordprocessingGroup" xmlns:wpi="http://schemas.microsoft.com/office/word/2010/wordprocessingInk" xmlns:wne="http://schemas.microsoft.com/office/word/2006/wordml" xmlns:wps="http://schemas.microsoft.com/office/word/2010/wordprocessingShape" mc:Ignorable="w14 w15 w16se w16cid w16 w16cex w16sdtdh w16sdtfl w16du wp14">
+<w:hdr xmlns:wpc="http://schemas.microsoft.com/office/word/2010/wordprocessingCanvas" xmlns:cx="http://schemas.microsoft.com/office/drawing/2014/chartex" xmlns:cx1="http://schemas.microsoft.com/office/drawing/2015/9/8/chartex" xmlns:cx2="http://schemas.microsoft.com/office/drawing/2015/10/21/chartex" xmlns:cx3="http://schemas.microsoft.com/office/drawing/2016/5/9/chartex" xmlns:cx4="http://schemas.microsoft.com/office/drawing/2016/5/10/chartex" xmlns:cx5="http://schemas.microsoft.com/office/drawing/2016/5/11/chartex" xmlns:cx6="http://schemas.microsoft.com/office/drawing/2016/5/12/chartex" xmlns:cx7="http://schemas.microsoft.com/office/drawing/2016/5/13/chartex" xmlns:cx8="http://schemas.microsoft.com/office/drawing/2016/5/14/chartex" xmlns:mc="http://schemas.openxmlformats.org/markup-compatibility/2006" xmlns:aink="http://schemas.microsoft.com/office/drawing/2016/ink" xmlns:am3d="http://schemas.microsoft.com/office/drawing/2017/model3d" xmlns:o="urn:schemas-microsoft-com:office:office" xmlns:oel="http://schemas.microsoft.com/office/2019/extlst" xmlns:r="http://schemas.openxmlformats.org/officeDocument/2006/relationships" xmlns:m="http://schemas.openxmlformats.org/officeDocument/2006/math" xmlns:v="urn:schemas-microsoft-com:vml" xmlns:wp14="http://schemas.microsoft.com/office/word/2010/wordprocessingDrawing" xmlns:wp="http://schemas.openxmlformats.org/drawingml/2006/wordprocessingDrawing" xmlns:w10="urn:schemas-microsoft-com:office:word" xmlns:w="http://schemas.openxmlformats.org/wordprocessingml/2006/main" xmlns:w14="http://schemas.microsoft.com/office/word/2010/wordml" xmlns:w15="http://schemas.microsoft.com/office/word/2012/wordml" xmlns:w16cei="http://schemas.microsoft.com/office/word/2026/wordml/cei" xmlns:w16cex="http://schemas.microsoft.com/office/word/2018/wordml/cex" xmlns:w16cid="http://schemas.microsoft.com/office/word/2016/wordml/cid" xmlns:w16="http://schemas.microsoft.com/office/word/2018/wordml" xmlns:w16du="http://schemas.microsoft.com/office/word/2023/wordml/word16du" xmlns:w16sdtdh="http://schemas.microsoft.com/office/word/2020/wordml/sdtdatahash" xmlns:w16sdtfl="http://schemas.microsoft.com/office/word/2024/wordml/sdtformatlock" xmlns:w16se="http://schemas.microsoft.com/office/word/2015/wordml/symex" xmlns:wpg="http://schemas.microsoft.com/office/word/2010/wordprocessingGroup" xmlns:wpi="http://schemas.microsoft.com/office/word/2010/wordprocessingInk" xmlns:wne="http://schemas.microsoft.com/office/word/2006/wordml" xmlns:wps="http://schemas.microsoft.com/office/word/2010/wordprocessingShape" mc:Ignorable="w14 w15 w16se w16cid w16 w16cex w16sdtdh w16sdtfl w16du wp14">
   <w:p>
     <w:pPr>
       <w:pStyle w:val="En-tte"/>
@@ -16993,7 +16991,7 @@
 </file>
 
 <file path=word/numbering.xml><?xml version="1.0" encoding="utf-8"?>
-<w:numbering xmlns:wpc="http://schemas.microsoft.com/office/word/2010/wordprocessingCanvas" xmlns:cx="http://schemas.microsoft.com/office/drawing/2014/chartex" xmlns:cx1="http://schemas.microsoft.com/office/drawing/2015/9/8/chartex" xmlns:cx2="http://schemas.microsoft.com/office/drawing/2015/10/21/chartex" xmlns:cx3="http://schemas.microsoft.com/office/drawing/2016/5/9/chartex" xmlns:cx4="http://schemas.microsoft.com/office/drawing/2016/5/10/chartex" xmlns:cx5="http://schemas.microsoft.com/office/drawing/2016/5/11/chartex" xmlns:cx6="http://schemas.microsoft.com/office/drawing/2016/5/12/chartex" xmlns:cx7="http://schemas.microsoft.com/office/drawing/2016/5/13/chartex" xmlns:cx8="http://schemas.microsoft.com/office/drawing/2016/5/14/chartex" xmlns:mc="http://schemas.openxmlformats.org/markup-compatibility/2006" xmlns:aink="http://schemas.microsoft.com/office/drawing/2016/ink" xmlns:am3d="http://schemas.microsoft.com/office/drawing/2017/model3d" xmlns:o="urn:schemas-microsoft-com:office:office" xmlns:oel="http://schemas.microsoft.com/office/2019/extlst" xmlns:r="http://schemas.openxmlformats.org/officeDocument/2006/relationships" xmlns:m="http://schemas.openxmlformats.org/officeDocument/2006/math" xmlns:v="urn:schemas-microsoft-com:vml" xmlns:wp14="http://schemas.microsoft.com/office/word/2010/wordprocessingDrawing" xmlns:wp="http://schemas.openxmlformats.org/drawingml/2006/wordprocessingDrawing" xmlns:w10="urn:schemas-microsoft-com:office:word" xmlns:w="http://schemas.openxmlformats.org/wordprocessingml/2006/main" xmlns:w14="http://schemas.microsoft.com/office/word/2010/wordml" xmlns:w15="http://schemas.microsoft.com/office/word/2012/wordml" xmlns:w16cex="http://schemas.microsoft.com/office/word/2018/wordml/cex" xmlns:w16cid="http://schemas.microsoft.com/office/word/2016/wordml/cid" xmlns:w16="http://schemas.microsoft.com/office/word/2018/wordml" xmlns:w16du="http://schemas.microsoft.com/office/word/2023/wordml/word16du" xmlns:w16sdtdh="http://schemas.microsoft.com/office/word/2020/wordml/sdtdatahash" xmlns:w16sdtfl="http://schemas.microsoft.com/office/word/2024/wordml/sdtformatlock" xmlns:w16se="http://schemas.microsoft.com/office/word/2015/wordml/symex" xmlns:wpg="http://schemas.microsoft.com/office/word/2010/wordprocessingGroup" xmlns:wpi="http://schemas.microsoft.com/office/word/2010/wordprocessingInk" xmlns:wne="http://schemas.microsoft.com/office/word/2006/wordml" xmlns:wps="http://schemas.microsoft.com/office/word/2010/wordprocessingShape" mc:Ignorable="w14 w15 w16se w16cid w16 w16cex w16sdtdh w16sdtfl w16du wp14">
+<w:numbering xmlns:wpc="http://schemas.microsoft.com/office/word/2010/wordprocessingCanvas" xmlns:cx="http://schemas.microsoft.com/office/drawing/2014/chartex" xmlns:cx1="http://schemas.microsoft.com/office/drawing/2015/9/8/chartex" xmlns:cx2="http://schemas.microsoft.com/office/drawing/2015/10/21/chartex" xmlns:cx3="http://schemas.microsoft.com/office/drawing/2016/5/9/chartex" xmlns:cx4="http://schemas.microsoft.com/office/drawing/2016/5/10/chartex" xmlns:cx5="http://schemas.microsoft.com/office/drawing/2016/5/11/chartex" xmlns:cx6="http://schemas.microsoft.com/office/drawing/2016/5/12/chartex" xmlns:cx7="http://schemas.microsoft.com/office/drawing/2016/5/13/chartex" xmlns:cx8="http://schemas.microsoft.com/office/drawing/2016/5/14/chartex" xmlns:mc="http://schemas.openxmlformats.org/markup-compatibility/2006" xmlns:aink="http://schemas.microsoft.com/office/drawing/2016/ink" xmlns:am3d="http://schemas.microsoft.com/office/drawing/2017/model3d" xmlns:o="urn:schemas-microsoft-com:office:office" xmlns:oel="http://schemas.microsoft.com/office/2019/extlst" xmlns:r="http://schemas.openxmlformats.org/officeDocument/2006/relationships" xmlns:m="http://schemas.openxmlformats.org/officeDocument/2006/math" xmlns:v="urn:schemas-microsoft-com:vml" xmlns:wp14="http://schemas.microsoft.com/office/word/2010/wordprocessingDrawing" xmlns:wp="http://schemas.openxmlformats.org/drawingml/2006/wordprocessingDrawing" xmlns:w10="urn:schemas-microsoft-com:office:word" xmlns:w="http://schemas.openxmlformats.org/wordprocessingml/2006/main" xmlns:w14="http://schemas.microsoft.com/office/word/2010/wordml" xmlns:w15="http://schemas.microsoft.com/office/word/2012/wordml" xmlns:w16cei="http://schemas.microsoft.com/office/word/2026/wordml/cei" xmlns:w16cex="http://schemas.microsoft.com/office/word/2018/wordml/cex" xmlns:w16cid="http://schemas.microsoft.com/office/word/2016/wordml/cid" xmlns:w16="http://schemas.microsoft.com/office/word/2018/wordml" xmlns:w16du="http://schemas.microsoft.com/office/word/2023/wordml/word16du" xmlns:w16sdtdh="http://schemas.microsoft.com/office/word/2020/wordml/sdtdatahash" xmlns:w16sdtfl="http://schemas.microsoft.com/office/word/2024/wordml/sdtformatlock" xmlns:w16se="http://schemas.microsoft.com/office/word/2015/wordml/symex" xmlns:wpg="http://schemas.microsoft.com/office/word/2010/wordprocessingGroup" xmlns:wpi="http://schemas.microsoft.com/office/word/2010/wordprocessingInk" xmlns:wne="http://schemas.microsoft.com/office/word/2006/wordml" xmlns:wps="http://schemas.microsoft.com/office/word/2010/wordprocessingShape" mc:Ignorable="w14 w15 w16se w16cid w16 w16cex w16sdtdh w16sdtfl w16du wp14">
   <w:abstractNum w:abstractNumId="0" w15:restartNumberingAfterBreak="0">
     <w:nsid w:val="007B2E81"/>
     <w:multiLevelType w:val="multilevel"/>
@@ -22760,16 +22758,25 @@
 </file>
 
 <file path=customXml/item1.xml><?xml version="1.0" encoding="utf-8"?>
+<b:Sources xmlns:b="http://schemas.openxmlformats.org/officeDocument/2006/bibliography" xmlns="http://schemas.openxmlformats.org/officeDocument/2006/bibliography" SelectedStyle="\APASixthEditionOfficeOnline.xsl" StyleName="APA" Version="6"/>
+</file>
+
+<file path=customXml/item2.xml><?xml version="1.0" encoding="utf-8"?>
 <p:properties xmlns:p="http://schemas.microsoft.com/office/2006/metadata/properties" xmlns:xsi="http://www.w3.org/2001/XMLSchema-instance" xmlns:pc="http://schemas.microsoft.com/office/infopath/2007/PartnerControls">
   <documentManagement/>
 </p:properties>
 </file>
 
-<file path=customXml/item2.xml><?xml version="1.0" encoding="utf-8"?>
-<b:Sources xmlns:b="http://schemas.openxmlformats.org/officeDocument/2006/bibliography" xmlns="http://schemas.openxmlformats.org/officeDocument/2006/bibliography" SelectedStyle="\APASixthEditionOfficeOnline.xsl" StyleName="APA" Version="6"/>
+<file path=customXml/item3.xml><?xml version="1.0" encoding="utf-8"?>
+<?mso-contentType ?>
+<FormTemplates xmlns="http://schemas.microsoft.com/sharepoint/v3/contenttype/forms">
+  <Display>DocumentLibraryForm</Display>
+  <Edit>DocumentLibraryForm</Edit>
+  <New>DocumentLibraryForm</New>
+</FormTemplates>
 </file>
 
-<file path=customXml/item3.xml><?xml version="1.0" encoding="utf-8"?>
+<file path=customXml/item4.xml><?xml version="1.0" encoding="utf-8"?>
 <ct:contentTypeSchema xmlns:ct="http://schemas.microsoft.com/office/2006/metadata/contentType" xmlns:ma="http://schemas.microsoft.com/office/2006/metadata/properties/metaAttributes" ct:_="" ma:_="" ma:contentTypeName="Document" ma:contentTypeID="0x010100354AEAE9FD62D747A26A546E5B1B5735" ma:contentTypeVersion="7" ma:contentTypeDescription="Crée un document." ma:contentTypeScope="" ma:versionID="43b763fe9aa20b7a2976a5e019d82dbf">
   <xsd:schema xmlns:xsd="http://www.w3.org/2001/XMLSchema" xmlns:xs="http://www.w3.org/2001/XMLSchema" xmlns:p="http://schemas.microsoft.com/office/2006/metadata/properties" xmlns:ns2="071933db-0376-4694-9786-b56cb37c4ec2" targetNamespace="http://schemas.microsoft.com/office/2006/metadata/properties" ma:root="true" ma:fieldsID="d5c90ae6c1ec6ed317c9f5feddaf7a33" ns2:_="">
     <xsd:import namespace="071933db-0376-4694-9786-b56cb37c4ec2"/>
@@ -22933,16 +22940,15 @@
 </ct:contentTypeSchema>
 </file>
 
-<file path=customXml/item4.xml><?xml version="1.0" encoding="utf-8"?>
-<?mso-contentType ?>
-<FormTemplates xmlns="http://schemas.microsoft.com/sharepoint/v3/contenttype/forms">
-  <Display>DocumentLibraryForm</Display>
-  <Edit>DocumentLibraryForm</Edit>
-  <New>DocumentLibraryForm</New>
-</FormTemplates>
+<file path=customXml/itemProps1.xml><?xml version="1.0" encoding="utf-8"?>
+<ds:datastoreItem xmlns:ds="http://schemas.openxmlformats.org/officeDocument/2006/customXml" ds:itemID="{BA5DC8B6-1F73-4844-8DA8-B484D55D7FC3}">
+  <ds:schemaRefs>
+    <ds:schemaRef ds:uri="http://schemas.openxmlformats.org/officeDocument/2006/bibliography"/>
+  </ds:schemaRefs>
+</ds:datastoreItem>
 </file>
 
-<file path=customXml/itemProps1.xml><?xml version="1.0" encoding="utf-8"?>
+<file path=customXml/itemProps2.xml><?xml version="1.0" encoding="utf-8"?>
 <ds:datastoreItem xmlns:ds="http://schemas.openxmlformats.org/officeDocument/2006/customXml" ds:itemID="{2C36E056-BA2C-4A1F-9580-242C9B36FE70}">
   <ds:schemaRefs>
     <ds:schemaRef ds:uri="http://schemas.microsoft.com/office/2006/metadata/properties"/>
@@ -22951,15 +22957,15 @@
 </ds:datastoreItem>
 </file>
 
-<file path=customXml/itemProps2.xml><?xml version="1.0" encoding="utf-8"?>
-<ds:datastoreItem xmlns:ds="http://schemas.openxmlformats.org/officeDocument/2006/customXml" ds:itemID="{BA5DC8B6-1F73-4844-8DA8-B484D55D7FC3}">
+<file path=customXml/itemProps3.xml><?xml version="1.0" encoding="utf-8"?>
+<ds:datastoreItem xmlns:ds="http://schemas.openxmlformats.org/officeDocument/2006/customXml" ds:itemID="{F6194C16-5FE5-4670-BEC8-3D6DD9380312}">
   <ds:schemaRefs>
-    <ds:schemaRef ds:uri="http://schemas.openxmlformats.org/officeDocument/2006/bibliography"/>
+    <ds:schemaRef ds:uri="http://schemas.microsoft.com/sharepoint/v3/contenttype/forms"/>
   </ds:schemaRefs>
 </ds:datastoreItem>
 </file>
 
-<file path=customXml/itemProps3.xml><?xml version="1.0" encoding="utf-8"?>
+<file path=customXml/itemProps4.xml><?xml version="1.0" encoding="utf-8"?>
 <ds:datastoreItem xmlns:ds="http://schemas.openxmlformats.org/officeDocument/2006/customXml" ds:itemID="{5C3A06EC-DC03-4D65-AA15-C6B9D68C1ED0}">
   <ds:schemaRefs>
     <ds:schemaRef ds:uri="http://schemas.microsoft.com/office/2006/metadata/contentType"/>
@@ -22975,12 +22981,4 @@
     <ds:schemaRef ds:uri="http://schemas.microsoft.com/internal/obd"/>
   </ds:schemaRefs>
 </ds:datastoreItem>
-</file>
-
-<file path=customXml/itemProps4.xml><?xml version="1.0" encoding="utf-8"?>
-<ds:datastoreItem xmlns:ds="http://schemas.openxmlformats.org/officeDocument/2006/customXml" ds:itemID="{F6194C16-5FE5-4670-BEC8-3D6DD9380312}">
-  <ds:schemaRefs>
-    <ds:schemaRef ds:uri="http://schemas.microsoft.com/sharepoint/v3/contenttype/forms"/>
-  </ds:schemaRefs>
-</ds:datastoreItem>
 </file>
</xml_diff>